<commit_message>
Conference: full-grid tables (7pt body, 8pt bold headers, no trailing rules), humanized intro, strictly informative results, Figure/Table in-text refs, content fixes (no-SOH bounds, NASA-to-CALCE claim, 45% monotonicity); DOCX twin regenerated
</commit_message>
<xml_diff>
--- a/Multi_Horizon_Hazard_Models_for_Battery_Failure_Prediction_Within.docx
+++ b/Multi_Horizon_Hazard_Models_for_Battery_Failure_Prediction_Within.docx
@@ -16,6 +16,31 @@
       <w:pgMar w:top="1080" w:bottom="1440" w:left="900" w:right="900" w:header="480" w:footer="480" w:gutter="0"/>
       <w:type w:val="continuous"/>
     </w:sectPr>
+    <w:p>
+      <w:pPr>
+        <w:pStyle w:val="Author"/>
+      </w:pPr>
+    </w:p>
+    <w:p>
+      <w:pPr>
+        <w:pStyle w:val="Author"/>
+      </w:pPr>
+    </w:p>
+    <w:p>
+      <w:pPr>
+        <w:pStyle w:val="Author"/>
+      </w:pPr>
+    </w:p>
+    <w:p>
+      <w:pPr>
+        <w:pStyle w:val="Author"/>
+      </w:pPr>
+    </w:p>
+    <w:p>
+      <w:pPr>
+        <w:pStyle w:val="Author"/>
+      </w:pPr>
+    </w:p>
     <w:p>
       <w:pPr>
         <w:pStyle w:val="FirstParagraph"/>
@@ -428,39 +453,25 @@
       </w:pPr>
       <w:r>
         <w:rPr>
-          <w:b/>
-          <w:bCs/>
-          <w:sz w:val="18"/>
+          <w:i/>
+          <w:iCs/>
         </w:rPr>
-        <w:t xml:space="preserve">Index Terms—</w:t>
-      </w:r>
-      <w:r>
-        <w:rPr>
-          <w:b/>
-          <w:sz w:val="18"/>
-        </w:rPr>
-        <w:t xml:space="preserve"> </w:t>
-      </w:r>
-      <w:r>
-        <w:rPr>
-          <w:b/>
-          <w:sz w:val="18"/>
-        </w:rPr>
-        <w:t xml:space="preserve">battery management systems, machine learning, probability calibration,</w:t>
-      </w:r>
-      <w:r>
-        <w:rPr>
-          <w:b/>
-          <w:sz w:val="18"/>
-        </w:rPr>
-        <w:t xml:space="preserve"> </w:t>
-      </w:r>
-      <w:r>
-        <w:rPr>
-          <w:b/>
-          <w:sz w:val="18"/>
-        </w:rPr>
-        <w:t xml:space="preserve">prognostics and health management, transfer learning, dataset shift</w:t>
+        <w:t xml:space="preserve">Keywords—</w:t>
+      </w:r>
+      <w:r>
+        <w:t xml:space="preserve">battery management systems, machine</w:t>
+      </w:r>
+      <w:r>
+        <w:t xml:space="preserve"> </w:t>
+      </w:r>
+      <w:r>
+        <w:t xml:space="preserve">learning, probability calibration, prognostics and health management,</w:t>
+      </w:r>
+      <w:r>
+        <w:t xml:space="preserve"> </w:t>
+      </w:r>
+      <w:r>
+        <w:t xml:space="preserve">transfer learning, dataset shift.</w:t>
       </w:r>
     </w:p>
     <w:bookmarkStart w:id="9" w:name="i.-introduction-and-related-work"/>
@@ -477,85 +488,91 @@
         <w:pStyle w:val="FirstParagraph"/>
       </w:pPr>
       <w:r>
-        <w:t xml:space="preserve">Lithium-ion batteries are fundamental to electric vehicles and</w:t>
-      </w:r>
-      <w:r>
-        <w:t xml:space="preserve"> </w:t>
-      </w:r>
-      <w:r>
-        <w:t xml:space="preserve">grid-scale energy storage because of their high energy density, fast</w:t>
-      </w:r>
-      <w:r>
-        <w:t xml:space="preserve"> </w:t>
-      </w:r>
-      <w:r>
-        <w:t xml:space="preserve">charging capability, and long cycle life. Their degradation is highly</w:t>
-      </w:r>
-      <w:r>
-        <w:t xml:space="preserve"> </w:t>
-      </w:r>
-      <w:r>
-        <w:t xml:space="preserve">nonlinear, governed by complex electrochemical processes, which makes</w:t>
-      </w:r>
-      <w:r>
-        <w:t xml:space="preserve"> </w:t>
-      </w:r>
-      <w:r>
-        <w:t xml:space="preserve">battery failure prediction challenging. Although failures are</w:t>
-      </w:r>
-      <w:r>
-        <w:t xml:space="preserve"> </w:t>
-      </w:r>
-      <w:r>
-        <w:t xml:space="preserve">relatively infrequent, they can cause significant safety hazards and</w:t>
-      </w:r>
-      <w:r>
-        <w:t xml:space="preserve"> </w:t>
-      </w:r>
-      <w:r>
-        <w:t xml:space="preserve">economic losses, motivating reliable multi-horizon prognostics for</w:t>
-      </w:r>
-      <w:r>
-        <w:t xml:space="preserve"> </w:t>
-      </w:r>
-      <w:r>
-        <w:t xml:space="preserve">advanced battery management systems [1]. Battery</w:t>
-      </w:r>
-      <w:r>
-        <w:t xml:space="preserve"> </w:t>
-      </w:r>
-      <w:r>
-        <w:t xml:space="preserve">prognostics has primarily focused on state-of-health (SOH) estimation</w:t>
-      </w:r>
-      <w:r>
-        <w:t xml:space="preserve"> </w:t>
-      </w:r>
-      <w:r>
-        <w:t xml:space="preserve">and remaining useful life (RUL) prediction. Berecibar et</w:t>
-      </w:r>
-      <w:r>
-        <w:t xml:space="preserve"> </w:t>
-      </w:r>
-      <w:r>
-        <w:t xml:space="preserve">al. [1] reviewed conventional SOH methods, including</w:t>
-      </w:r>
-      <w:r>
-        <w:t xml:space="preserve"> </w:t>
-      </w:r>
-      <w:r>
-        <w:t xml:space="preserve">coulomb counting, impedance spectroscopy, Kalman filtering, fuzzy</w:t>
-      </w:r>
-      <w:r>
-        <w:t xml:space="preserve"> </w:t>
-      </w:r>
-      <w:r>
-        <w:t xml:space="preserve">logic, and machine learning. Recent studies have adopted deep learning,</w:t>
-      </w:r>
-      <w:r>
-        <w:t xml:space="preserve"> </w:t>
-      </w:r>
-      <w:r>
-        <w:t xml:space="preserve">including STL-LSTM with spatio-temporal attention [2],</w:t>
+        <w:t xml:space="preserve">Lithium-ion batteries have become the default choice for electric</w:t>
+      </w:r>
+      <w:r>
+        <w:t xml:space="preserve"> </w:t>
+      </w:r>
+      <w:r>
+        <w:t xml:space="preserve">vehicles and grid-scale energy storage, thanks to their high energy</w:t>
+      </w:r>
+      <w:r>
+        <w:t xml:space="preserve"> </w:t>
+      </w:r>
+      <w:r>
+        <w:t xml:space="preserve">density, fast charging capability, and long cycle life. The same</w:t>
+      </w:r>
+      <w:r>
+        <w:t xml:space="preserve"> </w:t>
+      </w:r>
+      <w:r>
+        <w:t xml:space="preserve">electrochemistry, however, degrades in complicated and highly</w:t>
+      </w:r>
+      <w:r>
+        <w:t xml:space="preserve"> </w:t>
+      </w:r>
+      <w:r>
+        <w:t xml:space="preserve">nonlinear ways, which is precisely what makes failure prediction</w:t>
+      </w:r>
+      <w:r>
+        <w:t xml:space="preserve"> </w:t>
+      </w:r>
+      <w:r>
+        <w:t xml:space="preserve">difficult. Individual failures may be uncommon, but the safety hazards</w:t>
+      </w:r>
+      <w:r>
+        <w:t xml:space="preserve"> </w:t>
+      </w:r>
+      <w:r>
+        <w:t xml:space="preserve">and economic losses they cause are serious enough that battery</w:t>
+      </w:r>
+      <w:r>
+        <w:t xml:space="preserve"> </w:t>
+      </w:r>
+      <w:r>
+        <w:t xml:space="preserve">management systems need forecasts they can genuinely rely</w:t>
+      </w:r>
+      <w:r>
+        <w:t xml:space="preserve"> </w:t>
+      </w:r>
+      <w:r>
+        <w:t xml:space="preserve">on [1]. Research effort has accordingly concentrated</w:t>
+      </w:r>
+      <w:r>
+        <w:t xml:space="preserve"> </w:t>
+      </w:r>
+      <w:r>
+        <w:t xml:space="preserve">on state-of-health (SOH) estimation and remaining useful life (RUL)</w:t>
+      </w:r>
+      <w:r>
+        <w:t xml:space="preserve"> </w:t>
+      </w:r>
+      <w:r>
+        <w:t xml:space="preserve">prediction. Reviews of conventional SOH methods, covering everything</w:t>
+      </w:r>
+      <w:r>
+        <w:t xml:space="preserve"> </w:t>
+      </w:r>
+      <w:r>
+        <w:t xml:space="preserve">from coulomb counting and impedance spectroscopy to Kalman filtering,</w:t>
+      </w:r>
+      <w:r>
+        <w:t xml:space="preserve"> </w:t>
+      </w:r>
+      <w:r>
+        <w:t xml:space="preserve">fuzzy logic, and machine learning, are well established [1].</w:t>
+      </w:r>
+      <w:r>
+        <w:t xml:space="preserve"> </w:t>
+      </w:r>
+      <w:r>
+        <w:t xml:space="preserve">More recently, deep learning has reshaped much of this landscape:</w:t>
+      </w:r>
+      <w:r>
+        <w:t xml:space="preserve"> </w:t>
+      </w:r>
+      <w:r>
+        <w:t xml:space="preserve">STL-LSTM models with spatio-temporal attention [2],</w:t>
       </w:r>
       <w:r>
         <w:t xml:space="preserve"> </w:t>
@@ -567,79 +584,109 @@
         <w:t xml:space="preserve"> </w:t>
       </w:r>
       <w:r>
-        <w:t xml:space="preserve">engineering [4]. Extensive reviews of RUL prediction are</w:t>
-      </w:r>
-      <w:r>
-        <w:t xml:space="preserve"> </w:t>
-      </w:r>
-      <w:r>
-        <w:t xml:space="preserve">available in [5]–[7], while LightGBM [8],</w:t>
-      </w:r>
-      <w:r>
-        <w:t xml:space="preserve"> </w:t>
-      </w:r>
-      <w:r>
-        <w:t xml:space="preserve">GRU-based [9], hybrid neural [10], and</w:t>
-      </w:r>
-      <w:r>
-        <w:t xml:space="preserve"> </w:t>
-      </w:r>
-      <w:r>
-        <w:t xml:space="preserve">convolutional architectures [11] have demonstrated</w:t>
-      </w:r>
-      <w:r>
-        <w:t xml:space="preserve"> </w:t>
-      </w:r>
-      <w:r>
-        <w:t xml:space="preserve">competitive lifetime prediction. Survival analysis has recently emerged as an alternative</w:t>
-      </w:r>
-      <w:r>
-        <w:t xml:space="preserve"> </w:t>
-      </w:r>
-      <w:r>
-        <w:t xml:space="preserve">paradigm [12]–[14]. Cross-chemistry transfer</w:t>
-      </w:r>
-      <w:r>
-        <w:t xml:space="preserve"> </w:t>
-      </w:r>
-      <w:r>
-        <w:t xml:space="preserve">has received little direct attention: Pang et al. [15]</w:t>
-      </w:r>
-      <w:r>
-        <w:t xml:space="preserve"> </w:t>
-      </w:r>
-      <w:r>
-        <w:t xml:space="preserve">proposed a Transformer–BiLSTM framework for multi-chemistry SOH</w:t>
-      </w:r>
-      <w:r>
-        <w:t xml:space="preserve"> </w:t>
-      </w:r>
-      <w:r>
-        <w:t xml:space="preserve">estimation, though their focus was SOH rather than failure prediction.</w:t>
-      </w:r>
-      <w:r>
-        <w:t xml:space="preserve"> </w:t>
-      </w:r>
-      <w:r>
-        <w:t xml:space="preserve">Probability calibration is similarly underexplored, despite established</w:t>
-      </w:r>
-      <w:r>
-        <w:t xml:space="preserve"> </w:t>
-      </w:r>
-      <w:r>
-        <w:t xml:space="preserve">methods [16]–[18]. Model</w:t>
-      </w:r>
-      <w:r>
-        <w:t xml:space="preserve"> </w:t>
-      </w:r>
-      <w:r>
-        <w:t xml:space="preserve">interpretability using SHAP [19] and public benchmark</w:t>
-      </w:r>
-      <w:r>
-        <w:t xml:space="preserve"> </w:t>
-      </w:r>
-      <w:r>
-        <w:t xml:space="preserve">datasets [20], [21] continue to advance the field.</w:t>
+        <w:t xml:space="preserve">engineering [4] are representative examples, and</w:t>
+      </w:r>
+      <w:r>
+        <w:t xml:space="preserve"> </w:t>
+      </w:r>
+      <w:r>
+        <w:t xml:space="preserve">comprehensive reviews of RUL prediction are also</w:t>
+      </w:r>
+      <w:r>
+        <w:t xml:space="preserve"> </w:t>
+      </w:r>
+      <w:r>
+        <w:t xml:space="preserve">available [5]–[7]. On the modeling side,</w:t>
+      </w:r>
+      <w:r>
+        <w:t xml:space="preserve"> </w:t>
+      </w:r>
+      <w:r>
+        <w:t xml:space="preserve">LightGBM [8], GRU-based [9], hybrid</w:t>
+      </w:r>
+      <w:r>
+        <w:t xml:space="preserve"> </w:t>
+      </w:r>
+      <w:r>
+        <w:t xml:space="preserve">neural [10], and convolutional [11]</w:t>
+      </w:r>
+      <w:r>
+        <w:t xml:space="preserve"> </w:t>
+      </w:r>
+      <w:r>
+        <w:t xml:space="preserve">architectures have each reported competitive lifetime prediction, and</w:t>
+      </w:r>
+      <w:r>
+        <w:t xml:space="preserve"> </w:t>
+      </w:r>
+      <w:r>
+        <w:t xml:space="preserve">survival analysis is steadily gaining ground as an alternative way to</w:t>
+      </w:r>
+      <w:r>
+        <w:t xml:space="preserve"> </w:t>
+      </w:r>
+      <w:r>
+        <w:t xml:space="preserve">frame the problem [12]–[14]. What has</w:t>
+      </w:r>
+      <w:r>
+        <w:t xml:space="preserve"> </w:t>
+      </w:r>
+      <w:r>
+        <w:t xml:space="preserve">received surprisingly little attention, by contrast, is what happens</w:t>
+      </w:r>
+      <w:r>
+        <w:t xml:space="preserve"> </w:t>
+      </w:r>
+      <w:r>
+        <w:t xml:space="preserve">when a trained model is pointed at a different chemistry. Pang et</w:t>
+      </w:r>
+      <w:r>
+        <w:t xml:space="preserve"> </w:t>
+      </w:r>
+      <w:r>
+        <w:t xml:space="preserve">al. [15] proposed a Transformer–BiLSTM framework for</w:t>
+      </w:r>
+      <w:r>
+        <w:t xml:space="preserve"> </w:t>
+      </w:r>
+      <w:r>
+        <w:t xml:space="preserve">multi-chemistry SOH estimation, but their focus remained SOH rather</w:t>
+      </w:r>
+      <w:r>
+        <w:t xml:space="preserve"> </w:t>
+      </w:r>
+      <w:r>
+        <w:t xml:space="preserve">than failure prediction. Probability calibration is similarly</w:t>
+      </w:r>
+      <w:r>
+        <w:t xml:space="preserve"> </w:t>
+      </w:r>
+      <w:r>
+        <w:t xml:space="preserve">neglected, despite the availability of established</w:t>
+      </w:r>
+      <w:r>
+        <w:t xml:space="preserve"> </w:t>
+      </w:r>
+      <w:r>
+        <w:t xml:space="preserve">methods [16]–[18]. In the</w:t>
+      </w:r>
+      <w:r>
+        <w:t xml:space="preserve"> </w:t>
+      </w:r>
+      <w:r>
+        <w:t xml:space="preserve">background, SHAP-based interpretability [19] and a</w:t>
+      </w:r>
+      <w:r>
+        <w:t xml:space="preserve"> </w:t>
+      </w:r>
+      <w:r>
+        <w:t xml:space="preserve">growing collection of public benchmark datasets [20], [21]</w:t>
+      </w:r>
+      <w:r>
+        <w:t xml:space="preserve"> </w:t>
+      </w:r>
+      <w:r>
+        <w:t xml:space="preserve">continue to advance the field as a whole.</w:t>
       </w:r>
     </w:p>
     <w:p>
@@ -647,79 +694,91 @@
         <w:pStyle w:val="BodyText"/>
       </w:pPr>
       <w:r>
-        <w:t xml:space="preserve">Nevertheless, a clear research gap remains. Most studies evaluate a</w:t>
-      </w:r>
-      <w:r>
-        <w:t xml:space="preserve"> </w:t>
-      </w:r>
-      <w:r>
-        <w:t xml:space="preserve">single dataset, chemistry, horizon, or metric, while cross-dataset</w:t>
-      </w:r>
-      <w:r>
-        <w:t xml:space="preserve"> </w:t>
-      </w:r>
-      <w:r>
-        <w:t xml:space="preserve">transfer, calibration, and significance testing are rarely studied</w:t>
-      </w:r>
-      <w:r>
-        <w:t xml:space="preserve"> </w:t>
-      </w:r>
-      <w:r>
-        <w:t xml:space="preserve">together. More fundamentally, it is unclear whether apparent transfer</w:t>
-      </w:r>
-      <w:r>
-        <w:t xml:space="preserve"> </w:t>
-      </w:r>
-      <w:r>
-        <w:t xml:space="preserve">performance reflects genuine degradation knowledge or a health-state</w:t>
-      </w:r>
-      <w:r>
-        <w:t xml:space="preserve"> </w:t>
-      </w:r>
-      <w:r>
-        <w:t xml:space="preserve">shortcut, since the composite failure label is defined from SOH while</w:t>
-      </w:r>
-      <w:r>
-        <w:t xml:space="preserve"> </w:t>
-      </w:r>
-      <w:r>
-        <w:t xml:space="preserve">SOH is also the strongest input feature. The DeLong</w:t>
-      </w:r>
-      <w:r>
-        <w:t xml:space="preserve"> </w:t>
-      </w:r>
-      <w:r>
-        <w:t xml:space="preserve">test [22] is common for</w:t>
-      </w:r>
-      <w:r>
-        <w:t xml:space="preserve"> </w:t>
-      </w:r>
-      <w:r>
-        <w:t xml:space="preserve">ROC comparison but treats every cycle-level prediction as independent</w:t>
-      </w:r>
-      <w:r>
-        <w:t xml:space="preserve"> </w:t>
-      </w:r>
-      <w:r>
-        <w:t xml:space="preserve">even though cycles within a cell are strongly correlated, and while the</w:t>
-      </w:r>
-      <w:r>
-        <w:t xml:space="preserve"> </w:t>
-      </w:r>
-      <w:r>
-        <w:t xml:space="preserve">Severson dataset [23] enables large-scale LFP</w:t>
-      </w:r>
-      <w:r>
-        <w:t xml:space="preserve"> </w:t>
-      </w:r>
-      <w:r>
-        <w:t xml:space="preserve">validation, it has not been widely paired with cross-chemistry</w:t>
-      </w:r>
-      <w:r>
-        <w:t xml:space="preserve"> </w:t>
-      </w:r>
-      <w:r>
-        <w:t xml:space="preserve">experiments.</w:t>
+        <w:t xml:space="preserve">Taken together, these threads leave a clear gap. Most studies still</w:t>
+      </w:r>
+      <w:r>
+        <w:t xml:space="preserve"> </w:t>
+      </w:r>
+      <w:r>
+        <w:t xml:space="preserve">evaluate a single dataset, chemistry, horizon, or metric, and</w:t>
+      </w:r>
+      <w:r>
+        <w:t xml:space="preserve"> </w:t>
+      </w:r>
+      <w:r>
+        <w:t xml:space="preserve">cross-dataset transfer, calibration, and significance testing are</w:t>
+      </w:r>
+      <w:r>
+        <w:t xml:space="preserve"> </w:t>
+      </w:r>
+      <w:r>
+        <w:t xml:space="preserve">rarely examined together. There is also a more basic concern that is</w:t>
+      </w:r>
+      <w:r>
+        <w:t xml:space="preserve"> </w:t>
+      </w:r>
+      <w:r>
+        <w:t xml:space="preserve">easy to overlook: it is often unclear whether apparent transfer</w:t>
+      </w:r>
+      <w:r>
+        <w:t xml:space="preserve"> </w:t>
+      </w:r>
+      <w:r>
+        <w:t xml:space="preserve">performance reflects genuine degradation knowledge or simply a</w:t>
+      </w:r>
+      <w:r>
+        <w:t xml:space="preserve"> </w:t>
+      </w:r>
+      <w:r>
+        <w:t xml:space="preserve">health-state shortcut. The composite failure label is defined from</w:t>
+      </w:r>
+      <w:r>
+        <w:t xml:space="preserve"> </w:t>
+      </w:r>
+      <w:r>
+        <w:t xml:space="preserve">SOH, and SOH happens to be the strongest input feature, so a model can</w:t>
+      </w:r>
+      <w:r>
+        <w:t xml:space="preserve"> </w:t>
+      </w:r>
+      <w:r>
+        <w:t xml:space="preserve">score well on transfer while doing little more than reading the label</w:t>
+      </w:r>
+      <w:r>
+        <w:t xml:space="preserve"> </w:t>
+      </w:r>
+      <w:r>
+        <w:t xml:space="preserve">criterion. A further practical issue concerns the DeLong</w:t>
+      </w:r>
+      <w:r>
+        <w:t xml:space="preserve"> </w:t>
+      </w:r>
+      <w:r>
+        <w:t xml:space="preserve">test [22], the usual tool for comparing ROC curves, which</w:t>
+      </w:r>
+      <w:r>
+        <w:t xml:space="preserve"> </w:t>
+      </w:r>
+      <w:r>
+        <w:t xml:space="preserve">treats every cycle-level prediction as independent even though cycles</w:t>
+      </w:r>
+      <w:r>
+        <w:t xml:space="preserve"> </w:t>
+      </w:r>
+      <w:r>
+        <w:t xml:space="preserve">within a cell are strongly correlated. Finally, although the Severson</w:t>
+      </w:r>
+      <w:r>
+        <w:t xml:space="preserve"> </w:t>
+      </w:r>
+      <w:r>
+        <w:t xml:space="preserve">dataset [23] makes large-scale LFP validation possible,</w:t>
+      </w:r>
+      <w:r>
+        <w:t xml:space="preserve"> </w:t>
+      </w:r>
+      <w:r>
+        <w:t xml:space="preserve">it has rarely been paired with cross-chemistry experiments.</w:t>
       </w:r>
     </w:p>
     <w:p>
@@ -920,25 +979,7 @@
         <w:pStyle w:val="ImageCaption"/>
       </w:pPr>
       <w:r>
-        <w:t xml:space="preserve">Overview of the proposed multi-horizon failure-risk framework:</w:t>
-      </w:r>
-      <w:r>
-        <w:t xml:space="preserve"> </w:t>
-      </w:r>
-      <w:r>
-        <w:t xml:space="preserve">datasets, features and labels, model families, per-horizon classifiers,</w:t>
-      </w:r>
-      <w:r>
-        <w:t xml:space="preserve"> </w:t>
-      </w:r>
-      <w:r>
-        <w:t xml:space="preserve">cross-fitted calibration, and the reliability, transfer, and</w:t>
-      </w:r>
-      <w:r>
-        <w:t xml:space="preserve"> </w:t>
-      </w:r>
-      <w:r>
-        <w:t xml:space="preserve">shortcut-control evaluations.</w:t>
+        <w:t xml:space="preserve">Overview of the proposed multi-horizon failure-risk framework.</w:t>
       </w:r>
     </w:p>
     <w:bookmarkEnd w:id="13"/>
@@ -1051,6 +1092,8 @@
             <w:r>
               <w:rPr>
                 <w:rFonts w:ascii="Times New Roman" w:hAnsi="Times New Roman"/>
+                <w:b/>
+                <w:bCs/>
                 <w:sz w:val="16"/>
               </w:rPr>
               <w:t xml:space="preserve">Dataset</w:t>
@@ -1072,6 +1115,8 @@
             <w:r>
               <w:rPr>
                 <w:rFonts w:ascii="Times New Roman" w:hAnsi="Times New Roman"/>
+                <w:b/>
+                <w:bCs/>
                 <w:sz w:val="16"/>
               </w:rPr>
               <w:t xml:space="preserve">Cells</w:t>
@@ -1093,6 +1138,8 @@
             <w:r>
               <w:rPr>
                 <w:rFonts w:ascii="Times New Roman" w:hAnsi="Times New Roman"/>
+                <w:b/>
+                <w:bCs/>
                 <w:sz w:val="16"/>
               </w:rPr>
               <w:t xml:space="preserve">Chem.</w:t>
@@ -1114,6 +1161,8 @@
             <w:r>
               <w:rPr>
                 <w:rFonts w:ascii="Times New Roman" w:hAnsi="Times New Roman"/>
+                <w:b/>
+                <w:bCs/>
                 <w:sz w:val="16"/>
               </w:rPr>
               <w:t xml:space="preserve">Cycles/Cell</w:t>
@@ -1135,6 +1184,8 @@
             <w:r>
               <w:rPr>
                 <w:rFonts w:ascii="Times New Roman" w:hAnsi="Times New Roman"/>
+                <w:b/>
+                <w:bCs/>
                 <w:sz w:val="16"/>
               </w:rPr>
               <w:t xml:space="preserve">Role</w:t>
@@ -2624,7 +2675,7 @@
         <w:t xml:space="preserve"> </w:t>
       </w:r>
       <w:r>
-        <w:t xml:space="preserve">up to 46% of within-dataset rows), which is why we say</w:t>
+        <w:t xml:space="preserve">up to 45% of within-dataset rows), which is why we say</w:t>
       </w:r>
       <w:r>
         <w:t xml:space="preserve"> </w:t>
@@ -2746,7 +2797,7 @@
         <w:t xml:space="preserve"> </w:t>
       </w:r>
       <w:r>
-        <w:t xml:space="preserve">and the cell — not the cycle — is the experimental unit.</w:t>
+        <w:t xml:space="preserve">and the cell, not the cycle, is the experimental unit.</w:t>
       </w:r>
     </w:p>
     <w:bookmarkEnd w:id="17"/>
@@ -3468,13 +3519,13 @@
         <w:t xml:space="preserve"> </w:t>
       </w:r>
       <w:r>
-        <w:t xml:space="preserve">cycles). We consider two feature settings — the full feature set and</w:t>
-      </w:r>
-      <w:r>
-        <w:t xml:space="preserve"> </w:t>
-      </w:r>
-      <w:r>
-        <w:t xml:space="preserve">SOH removed — to test whether cross-chemistry performance reflects</w:t>
+        <w:t xml:space="preserve">cycles). We consider two feature settings, the full feature set and</w:t>
+      </w:r>
+      <w:r>
+        <w:t xml:space="preserve"> </w:t>
+      </w:r>
+      <w:r>
+        <w:t xml:space="preserve">SOH removed, to test whether cross-chemistry performance reflects</w:t>
       </w:r>
       <w:r>
         <w:t xml:space="preserve"> </w:t>
@@ -3602,19 +3653,19 @@
         <w:pStyle w:val="FirstParagraph"/>
       </w:pPr>
       <w:r>
-        <w:t xml:space="preserve">Table II shows fold-mean Platt-calibrated AUC per</w:t>
-      </w:r>
-      <w:r>
-        <w:t xml:space="preserve"> </w:t>
-      </w:r>
-      <w:r>
-        <w:t xml:space="preserve">horizon. Every one of the 32 model–horizon–dataset combinations</w:t>
-      </w:r>
-      <w:r>
-        <w:t xml:space="preserve"> </w:t>
-      </w:r>
-      <w:r>
-        <w:t xml:space="preserve">reaches a fold-mean AUC of at least 0.85 under the clean protocol</w:t>
+        <w:t xml:space="preserve">Table II reports fold-mean Platt-calibrated AUC per</w:t>
+      </w:r>
+      <w:r>
+        <w:t xml:space="preserve"> </w:t>
+      </w:r>
+      <w:r>
+        <w:t xml:space="preserve">horizon. All 32 model–horizon–dataset combinations reach a fold-mean</w:t>
+      </w:r>
+      <w:r>
+        <w:t xml:space="preserve"> </w:t>
+      </w:r>
+      <w:r>
+        <w:t xml:space="preserve">AUC of at least 0.85 under the clean protocol</w:t>
       </w:r>
       <w:r>
         <w:t xml:space="preserve"> </w:t>
@@ -3647,13 +3698,7 @@
         <w:pStyle w:val="TableCaption"/>
       </w:pPr>
       <w:r>
-        <w:t xml:space="preserve">Within-Dataset Platt-Calibrated Fold-Mean AUC and Mean Brier</w:t>
-      </w:r>
-      <w:r>
-        <w:t xml:space="preserve"> </w:t>
-      </w:r>
-      <w:r>
-        <w:t xml:space="preserve">Score per Horizon (Cell-Disjoint CV; CALCE Is Leave-One-Cell-Out)</w:t>
+        <w:t xml:space="preserve">Within-Dataset Platt-Calibrated AUC and Brier Score</w:t>
       </w:r>
     </w:p>
     <w:tbl>
@@ -3661,7 +3706,7 @@
         <w:tblStyle w:val="Table"/>
         <w:tblW w:type="auto" w:w="0"/>
         <w:tblLook w:firstRow="1" w:lastRow="0" w:firstColumn="0" w:lastColumn="0" w:noHBand="0" w:noVBand="0" w:val="0020"/>
-        <w:tblCaption w:val="Within-Dataset Platt-Calibrated Fold-Mean AUC and Mean Brier Score per Horizon (Cell-Disjoint CV; CALCE Is Leave-One-Cell-Out)"/>
+        <w:tblCaption w:val="Within-Dataset Platt-Calibrated AUC and Brier Score"/>
         <w:tblBorders>
           <w:top w:val="single" w:sz="8" w:color="000000"/>
           <w:bottom w:val="single" w:sz="8" w:color="000000"/>
@@ -3700,6 +3745,8 @@
             <w:r>
               <w:rPr>
                 <w:rFonts w:ascii="Times New Roman" w:hAnsi="Times New Roman"/>
+                <w:b/>
+                <w:bCs/>
                 <w:sz w:val="16"/>
               </w:rPr>
               <w:t xml:space="preserve">Model</w:t>
@@ -3721,6 +3768,8 @@
             <w:r>
               <w:rPr>
                 <w:rFonts w:ascii="Times New Roman" w:hAnsi="Times New Roman"/>
+                <w:b/>
+                <w:bCs/>
                 <w:sz w:val="16"/>
               </w:rPr>
               <w:t xml:space="preserve">Dataset</w:t>
@@ -3742,6 +3791,8 @@
             <w:r>
               <w:rPr>
                 <w:rFonts w:ascii="Times New Roman" w:hAnsi="Times New Roman"/>
+                <w:b/>
+                <w:bCs/>
                 <w:sz w:val="16"/>
               </w:rPr>
               <w:t xml:space="preserve">H=10</w:t>
@@ -3763,6 +3814,8 @@
             <w:r>
               <w:rPr>
                 <w:rFonts w:ascii="Times New Roman" w:hAnsi="Times New Roman"/>
+                <w:b/>
+                <w:bCs/>
                 <w:sz w:val="16"/>
               </w:rPr>
               <w:t xml:space="preserve">H=20</w:t>
@@ -3784,6 +3837,8 @@
             <w:r>
               <w:rPr>
                 <w:rFonts w:ascii="Times New Roman" w:hAnsi="Times New Roman"/>
+                <w:b/>
+                <w:bCs/>
                 <w:sz w:val="16"/>
               </w:rPr>
               <w:t xml:space="preserve">H=30</w:t>
@@ -3805,6 +3860,8 @@
             <w:r>
               <w:rPr>
                 <w:rFonts w:ascii="Times New Roman" w:hAnsi="Times New Roman"/>
+                <w:b/>
+                <w:bCs/>
                 <w:sz w:val="16"/>
               </w:rPr>
               <w:t xml:space="preserve">H=50</w:t>
@@ -3826,6 +3883,8 @@
             <w:r>
               <w:rPr>
                 <w:rFonts w:ascii="Times New Roman" w:hAnsi="Times New Roman"/>
+                <w:b/>
+                <w:bCs/>
                 <w:sz w:val="16"/>
               </w:rPr>
               <w:t xml:space="preserve">Mean</w:t>
@@ -3847,6 +3906,8 @@
             <w:r>
               <w:rPr>
                 <w:rFonts w:ascii="Times New Roman" w:hAnsi="Times New Roman"/>
+                <w:b/>
+                <w:bCs/>
                 <w:sz w:val="16"/>
               </w:rPr>
               <w:t xml:space="preserve">Brier</w:t>
@@ -5014,13 +5075,7 @@
         <w:pStyle w:val="ImageCaption"/>
       </w:pPr>
       <w:r>
-        <w:t xml:space="preserve">Within-dataset fold-mean Platt AUC across prediction horizons</w:t>
-      </w:r>
-      <w:r>
-        <w:t xml:space="preserve"> </w:t>
-      </w:r>
-      <w:r>
-        <w:t xml:space="preserve">(NASA and CALCE, cell-disjoint CV).</w:t>
+        <w:t xml:space="preserve">Within-dataset fold-mean Platt AUC across horizons.</w:t>
       </w:r>
     </w:p>
     <w:bookmarkEnd w:id="25"/>
@@ -5030,13 +5085,7 @@
         <w:pStyle w:val="TableCaption"/>
       </w:pPr>
       <w:r>
-        <w:t xml:space="preserve">Calibration Method Comparison (Mean Across Tree Models;</w:t>
-      </w:r>
-      <w:r>
-        <w:t xml:space="preserve"> </w:t>
-      </w:r>
-      <w:r>
-        <w:t xml:space="preserve">Calibrators Fitted on Cross-Fitted Out-of-Fold Scores)</w:t>
+        <w:t xml:space="preserve">Calibration Method Comparison (Mean Across Tree Models)</w:t>
       </w:r>
     </w:p>
     <w:tbl>
@@ -5044,7 +5093,7 @@
         <w:tblStyle w:val="Table"/>
         <w:tblW w:type="auto" w:w="0"/>
         <w:tblLook w:firstRow="1" w:lastRow="0" w:firstColumn="0" w:lastColumn="0" w:noHBand="0" w:noVBand="0" w:val="0020"/>
-        <w:tblCaption w:val="Calibration Method Comparison (Mean Across Tree Models; Calibrators Fitted on Cross-Fitted Out-of-Fold Scores)"/>
+        <w:tblCaption w:val="Calibration Method Comparison (Mean Across Tree Models)"/>
         <w:tblBorders>
           <w:top w:val="single" w:sz="8" w:color="000000"/>
           <w:bottom w:val="single" w:sz="8" w:color="000000"/>
@@ -5081,6 +5130,8 @@
             <w:r>
               <w:rPr>
                 <w:rFonts w:ascii="Times New Roman" w:hAnsi="Times New Roman"/>
+                <w:b/>
+                <w:bCs/>
                 <w:sz w:val="16"/>
               </w:rPr>
               <w:t xml:space="preserve">Dataset</w:t>
@@ -5102,6 +5153,8 @@
             <w:r>
               <w:rPr>
                 <w:rFonts w:ascii="Times New Roman" w:hAnsi="Times New Roman"/>
+                <w:b/>
+                <w:bCs/>
                 <w:sz w:val="16"/>
               </w:rPr>
               <w:t xml:space="preserve">Method</w:t>
@@ -5123,6 +5176,8 @@
             <w:r>
               <w:rPr>
                 <w:rFonts w:ascii="Times New Roman" w:hAnsi="Times New Roman"/>
+                <w:b/>
+                <w:bCs/>
                 <w:sz w:val="16"/>
               </w:rPr>
               <w:t xml:space="preserve">AUC</w:t>
@@ -5144,6 +5199,8 @@
             <w:r>
               <w:rPr>
                 <w:rFonts w:ascii="Times New Roman" w:hAnsi="Times New Roman"/>
+                <w:b/>
+                <w:bCs/>
                 <w:sz w:val="16"/>
               </w:rPr>
               <w:t xml:space="preserve">Brier</w:t>
@@ -5165,6 +5222,8 @@
             <w:r>
               <w:rPr>
                 <w:rFonts w:ascii="Times New Roman" w:hAnsi="Times New Roman"/>
+                <w:b/>
+                <w:bCs/>
                 <w:sz w:val="16"/>
               </w:rPr>
               <w:t xml:space="preserve">ECE</w:t>
@@ -5186,6 +5245,8 @@
             <w:r>
               <w:rPr>
                 <w:rFonts w:ascii="Times New Roman" w:hAnsi="Times New Roman"/>
+                <w:b/>
+                <w:bCs/>
                 <w:sz w:val="16"/>
               </w:rPr>
               <w:t xml:space="preserve">Slope</w:t>
@@ -5846,103 +5907,49 @@
         <w:t xml:space="preserve"> </w:t>
       </w:r>
       <w:r>
-        <w:t xml:space="preserve">up to the ties it introduces and fold-mean AUC differences are small;</w:t>
-      </w:r>
-      <w:r>
-        <w:t xml:space="preserve"> </w:t>
-      </w:r>
-      <w:r>
-        <w:t xml:space="preserve">but isotonic’s tied step groups cost precision–recall dearly, and</w:t>
-      </w:r>
-      <w:r>
-        <w:t xml:space="preserve"> </w:t>
-      </w:r>
-      <w:r>
-        <w:t xml:space="preserve">Platt’s fitted slope on CALCE is only 0.01 — under</w:t>
-      </w:r>
-      <w:r>
-        <w:t xml:space="preserve"> </w:t>
-      </w:r>
-      <w:r>
-        <w:t xml:space="preserve">leave-one-cell-out the out-of-fold sigmoid washes confidence toward</w:t>
-      </w:r>
-      <w:r>
-        <w:t xml:space="preserve"> </w:t>
-      </w:r>
-      <w:r>
-        <w:t xml:space="preserve">the base rate while preserving ranking. We therefore read the</w:t>
-      </w:r>
-      <w:r>
-        <w:t xml:space="preserve"> </w:t>
-      </w:r>
-      <w:r>
-        <w:t xml:space="preserve">comparison as: Platt</w:t>
-      </w:r>
-      <w:r>
-        <w:t xml:space="preserve"> </w:t>
-      </w:r>
-      <w:r>
-        <w:rPr>
-          <w:i/>
-          <w:iCs/>
-        </w:rPr>
-        <w:t xml:space="preserve">preserves discrimination best while</w:t>
-      </w:r>
-      <w:r>
-        <w:rPr>
-          <w:i/>
-          <w:iCs/>
-        </w:rPr>
-        <w:t xml:space="preserve"> </w:t>
-      </w:r>
-      <w:r>
-        <w:rPr>
-          <w:i/>
-          <w:iCs/>
-        </w:rPr>
-        <w:t xml:space="preserve">achieving calibration error comparable to or better than isotonic</w:t>
-      </w:r>
-      <w:r>
-        <w:t xml:space="preserve"> </w:t>
-      </w:r>
-      <w:r>
-        <w:t xml:space="preserve">—</w:t>
-      </w:r>
-      <w:r>
-        <w:t xml:space="preserve"> </w:t>
-      </w:r>
-      <w:r>
-        <w:t xml:space="preserve">a materially weaker and more defensible claim than</w:t>
-      </w:r>
-      <w:r>
-        <w:t xml:space="preserve"> </w:t>
-      </w:r>
-      <w:r>
-        <w:t xml:space="preserve">“Platt is the</w:t>
-      </w:r>
-      <w:r>
-        <w:t xml:space="preserve"> </w:t>
-      </w:r>
-      <w:r>
-        <w:t xml:space="preserve">better calibrator”</w:t>
-      </w:r>
-      <w:r>
-        <w:t xml:space="preserve"> </w:t>
-      </w:r>
-      <w:r>
-        <w:t xml:space="preserve">— and raw scores remain the safest ranking</w:t>
-      </w:r>
-      <w:r>
-        <w:t xml:space="preserve"> </w:t>
-      </w:r>
-      <w:r>
-        <w:t xml:space="preserve">signal whenever the operating context is uncertain</w:t>
-      </w:r>
-      <w:r>
-        <w:t xml:space="preserve"> </w:t>
-      </w:r>
-      <w:r>
-        <w:t xml:space="preserve">(Fig. 3).</w:t>
+        <w:t xml:space="preserve">up to the ties it introduces and fold-mean AUC differences are small.</w:t>
+      </w:r>
+      <w:r>
+        <w:t xml:space="preserve"> </w:t>
+      </w:r>
+      <w:r>
+        <w:t xml:space="preserve">Isotonic’s tied step groups cost precision–recall, and Platt’s fitted</w:t>
+      </w:r>
+      <w:r>
+        <w:t xml:space="preserve"> </w:t>
+      </w:r>
+      <w:r>
+        <w:t xml:space="preserve">slope on CALCE is only 0.01: under leave-one-cell-out the out-of-fold</w:t>
+      </w:r>
+      <w:r>
+        <w:t xml:space="preserve"> </w:t>
+      </w:r>
+      <w:r>
+        <w:t xml:space="preserve">sigmoid reduces confidence toward the base rate while preserving</w:t>
+      </w:r>
+      <w:r>
+        <w:t xml:space="preserve"> </w:t>
+      </w:r>
+      <w:r>
+        <w:t xml:space="preserve">ranking. Platt therefore preserves discrimination best while achieving</w:t>
+      </w:r>
+      <w:r>
+        <w:t xml:space="preserve"> </w:t>
+      </w:r>
+      <w:r>
+        <w:t xml:space="preserve">calibration error comparable to or better than isotonic, and raw</w:t>
+      </w:r>
+      <w:r>
+        <w:t xml:space="preserve"> </w:t>
+      </w:r>
+      <w:r>
+        <w:t xml:space="preserve">scores remain the safest ranking signal when the operating context is</w:t>
+      </w:r>
+      <w:r>
+        <w:t xml:space="preserve"> </w:t>
+      </w:r>
+      <w:r>
+        <w:t xml:space="preserve">uncertain (Fig. 3).</w:t>
       </w:r>
     </w:p>
     <w:bookmarkStart w:id="31" w:name="fig:reliability"/>
@@ -6005,7 +6012,37 @@
         <w:t xml:space="preserve"> </w:t>
       </w:r>
       <w:r>
-        <w:t xml:space="preserve">Within CALCE (XGBoost,</w:t>
+        <w:t xml:space="preserve">Within CALCE. (b) ALL-LCO</w:t>
+      </w:r>
+      <m:oMath>
+        <m:r>
+          <m:rPr>
+            <m:sty m:val="p"/>
+          </m:rPr>
+          <m:t>→</m:t>
+        </m:r>
+      </m:oMath>
+      <w:r>
+        <w:t xml:space="preserve">Severson without SOH.</w:t>
+      </w:r>
+    </w:p>
+    <w:bookmarkEnd w:id="31"/>
+    <w:bookmarkEnd w:id="32"/>
+    <w:bookmarkStart w:id="38" w:name="X1e7675d1853bec8bf505d9ff36e4121f83f337d"/>
+    <w:p>
+      <w:pPr>
+        <w:pStyle w:val="Heading2"/>
+      </w:pPr>
+      <w:r>
+        <w:t xml:space="preserve">III-C Cross-Dataset Transfer and the SOH Shortcut</w:t>
+      </w:r>
+    </w:p>
+    <w:p>
+      <w:pPr>
+        <w:pStyle w:val="FirstParagraph"/>
+      </w:pPr>
+      <w:r>
+        <w:t xml:space="preserve">Table IV reports transfer at</w:t>
       </w:r>
       <w:r>
         <w:t xml:space="preserve"> </w:t>
@@ -6025,13 +6062,34 @@
         </m:r>
       </m:oMath>
       <w:r>
-        <w:t xml:space="preserve">; ECE: raw 0.11, Platt 0.04, isotonic</w:t>
-      </w:r>
-      <w:r>
-        <w:t xml:space="preserve"> </w:t>
-      </w:r>
-      <w:r>
-        <w:t xml:space="preserve">0.05). (b) ALL-LCO</w:t>
+        <w:t xml:space="preserve"> </w:t>
+      </w:r>
+      <w:r>
+        <w:t xml:space="preserve">with and without</w:t>
+      </w:r>
+      <w:r>
+        <w:t xml:space="preserve"> </w:t>
+      </w:r>
+      <w:r>
+        <w:t xml:space="preserve">SOH as a feature; transfer is reported in raw AUC because calibration</w:t>
+      </w:r>
+      <w:r>
+        <w:t xml:space="preserve"> </w:t>
+      </w:r>
+      <w:r>
+        <w:t xml:space="preserve">parameters are dataset-specific. With SOH included, the tree ensembles</w:t>
+      </w:r>
+      <w:r>
+        <w:t xml:space="preserve"> </w:t>
+      </w:r>
+      <w:r>
+        <w:t xml:space="preserve">reach pooled AUC between 0.85 and 1.00. Removing SOH reduces every</w:t>
+      </w:r>
+      <w:r>
+        <w:t xml:space="preserve"> </w:t>
+      </w:r>
+      <w:r>
+        <w:t xml:space="preserve">tree model substantially: on NASA+CALCE</w:t>
       </w:r>
       <m:oMath>
         <m:r>
@@ -6042,7 +6100,73 @@
         </m:r>
       </m:oMath>
       <w:r>
-        <w:t xml:space="preserve">Severson without SOH (</w:t>
+        <w:t xml:space="preserve">Oxford, XGBoost falls from</w:t>
+      </w:r>
+      <w:r>
+        <w:t xml:space="preserve"> </w:t>
+      </w:r>
+      <w:r>
+        <w:t xml:space="preserve">0.917 to 0.429, no no-SOH configuration exceeds 0.59 on Oxford or 0.78</w:t>
+      </w:r>
+      <w:r>
+        <w:t xml:space="preserve"> </w:t>
+      </w:r>
+      <w:r>
+        <w:t xml:space="preserve">on Severson, and several configurations fall below 0.5, meaning the</w:t>
+      </w:r>
+      <w:r>
+        <w:t xml:space="preserve"> </w:t>
+      </w:r>
+      <w:r>
+        <w:t xml:space="preserve">remaining sensor features rank the target distribution worse than</w:t>
+      </w:r>
+      <w:r>
+        <w:t xml:space="preserve"> </w:t>
+      </w:r>
+      <w:r>
+        <w:t xml:space="preserve">chance. The GRU is unstable across training seeds under shift</w:t>
+      </w:r>
+      <w:r>
+        <w:t xml:space="preserve"> </w:t>
+      </w:r>
+      <w:r>
+        <w:t xml:space="preserve">(per-cell AUC from 0.21 to 1.00 at fixed settings) and shows no</w:t>
+      </w:r>
+      <w:r>
+        <w:t xml:space="preserve"> </w:t>
+      </w:r>
+      <w:r>
+        <w:t xml:space="preserve">transfer advantage despite using the same common feature set as the</w:t>
+      </w:r>
+      <w:r>
+        <w:t xml:space="preserve"> </w:t>
+      </w:r>
+      <w:r>
+        <w:t xml:space="preserve">trees in the matched comparison. Fig. 4 summarizes</w:t>
+      </w:r>
+      <w:r>
+        <w:t xml:space="preserve"> </w:t>
+      </w:r>
+      <w:r>
+        <w:t xml:space="preserve">the AUC drop caused by removing SOH across all source, target, and</w:t>
+      </w:r>
+      <w:r>
+        <w:t xml:space="preserve"> </w:t>
+      </w:r>
+      <w:r>
+        <w:t xml:space="preserve">model configurations.</w:t>
+      </w:r>
+    </w:p>
+    <w:bookmarkStart w:id="33" w:name="tab:transfer"/>
+    <w:p>
+      <w:pPr>
+        <w:pStyle w:val="TableCaption"/>
+      </w:pPr>
+      <w:r>
+        <w:t xml:space="preserve">Cross-Dataset Transfer at</w:t>
+      </w:r>
+      <w:r>
+        <w:t xml:space="preserve"> </w:t>
       </w:r>
       <m:oMath>
         <m:r>
@@ -6059,179 +6183,10 @@
         </m:r>
       </m:oMath>
       <w:r>
-        <w:t xml:space="preserve">): no</w:t>
-      </w:r>
-      <w:r>
-        <w:t xml:space="preserve"> </w:t>
-      </w:r>
-      <w:r>
-        <w:t xml:space="preserve">source-fitted calibrator lands near the diagonal on the shifted</w:t>
-      </w:r>
-      <w:r>
-        <w:t xml:space="preserve"> </w:t>
-      </w:r>
-      <w:r>
-        <w:t xml:space="preserve">target.</w:t>
-      </w:r>
-    </w:p>
-    <w:bookmarkEnd w:id="31"/>
-    <w:bookmarkEnd w:id="32"/>
-    <w:bookmarkStart w:id="38" w:name="X1e7675d1853bec8bf505d9ff36e4121f83f337d"/>
-    <w:p>
-      <w:pPr>
-        <w:pStyle w:val="Heading2"/>
-      </w:pPr>
-      <w:r>
-        <w:t xml:space="preserve">III-C Cross-Dataset Transfer and the SOH Shortcut</w:t>
-      </w:r>
-    </w:p>
-    <w:p>
-      <w:pPr>
-        <w:pStyle w:val="FirstParagraph"/>
-      </w:pPr>
-      <w:r>
-        <w:t xml:space="preserve">Table IV compares transfer at</w:t>
-      </w:r>
-      <w:r>
-        <w:t xml:space="preserve"> </w:t>
-      </w:r>
-      <m:oMath>
-        <m:r>
-          <m:t>H</m:t>
-        </m:r>
-        <m:r>
-          <m:rPr>
-            <m:sty m:val="p"/>
-          </m:rPr>
-          <m:t>=</m:t>
-        </m:r>
-        <m:r>
-          <m:t>20</m:t>
-        </m:r>
-      </m:oMath>
-      <w:r>
-        <w:t xml:space="preserve"> </w:t>
-      </w:r>
-      <w:r>
-        <w:t xml:space="preserve">with and</w:t>
-      </w:r>
-      <w:r>
-        <w:t xml:space="preserve"> </w:t>
-      </w:r>
-      <w:r>
-        <w:t xml:space="preserve">without SOH as a feature; transfer is reported in raw AUC because</w:t>
-      </w:r>
-      <w:r>
-        <w:t xml:space="preserve"> </w:t>
-      </w:r>
-      <w:r>
-        <w:t xml:space="preserve">calibration parameters are dataset-specific. With SOH included, the</w:t>
-      </w:r>
-      <w:r>
-        <w:t xml:space="preserve"> </w:t>
-      </w:r>
-      <w:r>
-        <w:t xml:space="preserve">tree ensembles reach pooled AUC between 0.85 and 1.00. Removing SOH</w:t>
-      </w:r>
-      <w:r>
-        <w:t xml:space="preserve"> </w:t>
-      </w:r>
-      <w:r>
-        <w:t xml:space="preserve">collapses every tree model: on NASA+CALCE</w:t>
-      </w:r>
-      <m:oMath>
-        <m:r>
-          <m:rPr>
-            <m:sty m:val="p"/>
-          </m:rPr>
-          <m:t>→</m:t>
-        </m:r>
-      </m:oMath>
-      <w:r>
-        <w:t xml:space="preserve">Oxford, XGBoost falls</w:t>
-      </w:r>
-      <w:r>
-        <w:t xml:space="preserve"> </w:t>
-      </w:r>
-      <w:r>
-        <w:t xml:space="preserve">from 0.917 to 0.429, no no-SOH configuration exceeds 0.58 on Oxford or</w:t>
-      </w:r>
-      <w:r>
-        <w:t xml:space="preserve"> </w:t>
-      </w:r>
-      <w:r>
-        <w:t xml:space="preserve">0.77 on Severson, and several fall below chance — the remaining</w:t>
-      </w:r>
-      <w:r>
-        <w:t xml:space="preserve"> </w:t>
-      </w:r>
-      <w:r>
-        <w:t xml:space="preserve">sensors rank the target distribution backwards. The GRU is highly</w:t>
-      </w:r>
-      <w:r>
-        <w:t xml:space="preserve"> </w:t>
-      </w:r>
-      <w:r>
-        <w:t xml:space="preserve">unstable across training seeds under shift (per-cell AUC from 0.21 to</w:t>
-      </w:r>
-      <w:r>
-        <w:t xml:space="preserve"> </w:t>
-      </w:r>
-      <w:r>
-        <w:t xml:space="preserve">1.00 at fixed settings) and offers no transfer advantage even though it</w:t>
-      </w:r>
-      <w:r>
-        <w:t xml:space="preserve"> </w:t>
-      </w:r>
-      <w:r>
-        <w:t xml:space="preserve">sees the same common feature set as the trees in the matched</w:t>
-      </w:r>
-      <w:r>
-        <w:t xml:space="preserve"> </w:t>
-      </w:r>
-      <w:r>
-        <w:t xml:space="preserve">comparison.</w:t>
-      </w:r>
-    </w:p>
-    <w:bookmarkStart w:id="33" w:name="tab:transfer"/>
-    <w:p>
-      <w:pPr>
-        <w:pStyle w:val="TableCaption"/>
-      </w:pPr>
-      <w:r>
-        <w:t xml:space="preserve">Cross-Dataset Transfer at</w:t>
-      </w:r>
-      <w:r>
-        <w:t xml:space="preserve"> </w:t>
-      </w:r>
-      <m:oMath>
-        <m:r>
-          <m:t>H</m:t>
-        </m:r>
-        <m:r>
-          <m:rPr>
-            <m:sty m:val="p"/>
-          </m:rPr>
-          <m:t>=</m:t>
-        </m:r>
-        <m:r>
-          <m:t>20</m:t>
-        </m:r>
-      </m:oMath>
-      <w:r>
-        <w:t xml:space="preserve">: Pooled Raw AUC With and</w:t>
-      </w:r>
-      <w:r>
-        <w:t xml:space="preserve"> </w:t>
-      </w:r>
-      <w:r>
-        <w:t xml:space="preserve">Without SOH (GRU Rows Use the Common Feature Set and Average Three</w:t>
-      </w:r>
-      <w:r>
-        <w:t xml:space="preserve"> </w:t>
-      </w:r>
-      <w:r>
-        <w:t xml:space="preserve">Seeds)</w:t>
+        <w:t xml:space="preserve"> </w:t>
+      </w:r>
+      <w:r>
+        <w:t xml:space="preserve">With and Without SOH (Pooled Raw AUC)</w:t>
       </w:r>
     </w:p>
     <w:tbl>
@@ -6239,7 +6194,7 @@
         <w:tblStyle w:val="Table"/>
         <w:tblW w:type="auto" w:w="0"/>
         <w:tblLook w:firstRow="1" w:lastRow="0" w:firstColumn="0" w:lastColumn="0" w:noHBand="0" w:noVBand="0" w:val="0020"/>
-        <w:tblCaption w:val="Cross-Dataset Transfer at H{=}20: Pooled Raw AUC With and Without SOH (GRU Rows Use the Common Feature Set and Average Three Seeds)"/>
+        <w:tblCaption w:val="Cross-Dataset Transfer at H{=}20 With and Without SOH (Pooled Raw AUC)"/>
         <w:tblBorders>
           <w:top w:val="single" w:sz="8" w:color="000000"/>
           <w:bottom w:val="single" w:sz="8" w:color="000000"/>
@@ -6250,10 +6205,12 @@
         </w:tblBorders>
       </w:tblPr>
       <w:tblGrid>
-        <w:gridCol w:w="1980"/>
-        <w:gridCol w:w="1980"/>
-        <w:gridCol w:w="1980"/>
-        <w:gridCol w:w="1980"/>
+        <w:gridCol w:w="1320"/>
+        <w:gridCol w:w="1320"/>
+        <w:gridCol w:w="1320"/>
+        <w:gridCol w:w="1320"/>
+        <w:gridCol w:w="1320"/>
+        <w:gridCol w:w="1320"/>
       </w:tblGrid>
       <w:tr>
         <w:trPr>
@@ -6274,6 +6231,8 @@
             <w:r>
               <w:rPr>
                 <w:rFonts w:ascii="Times New Roman" w:hAnsi="Times New Roman"/>
+                <w:b/>
+                <w:bCs/>
                 <w:sz w:val="16"/>
               </w:rPr>
               <w:t xml:space="preserve">Training</w:t>
@@ -6295,6 +6254,8 @@
             <w:r>
               <w:rPr>
                 <w:rFonts w:ascii="Times New Roman" w:hAnsi="Times New Roman"/>
+                <w:b/>
+                <w:bCs/>
                 <w:sz w:val="16"/>
               </w:rPr>
               <w:t xml:space="preserve">Model</w:t>
@@ -6316,24 +6277,11 @@
             <w:r>
               <w:rPr>
                 <w:rFonts w:ascii="Times New Roman" w:hAnsi="Times New Roman"/>
-                <w:sz w:val="16"/>
-              </w:rPr>
-              <w:t xml:space="preserve">Oxford (w/</w:t>
-            </w:r>
-            <m:oMath>
-              <m:r>
-                <m:rPr>
-                  <m:sty m:val="p"/>
-                </m:rPr>
-                <m:t>−</m:t>
-              </m:r>
-            </m:oMath>
-            <w:r>
-              <w:rPr>
-                <w:rFonts w:ascii="Times New Roman" w:hAnsi="Times New Roman"/>
-                <w:sz w:val="16"/>
-              </w:rPr>
-              <w:t xml:space="preserve">SOH)</w:t>
+                <w:b/>
+                <w:bCs/>
+                <w:sz w:val="16"/>
+              </w:rPr>
+              <w:t xml:space="preserve">Oxford w/ SOH</w:t>
             </w:r>
           </w:p>
         </w:tc>
@@ -6352,24 +6300,57 @@
             <w:r>
               <w:rPr>
                 <w:rFonts w:ascii="Times New Roman" w:hAnsi="Times New Roman"/>
-                <w:sz w:val="16"/>
-              </w:rPr>
-              <w:t xml:space="preserve">Severson (w/</w:t>
-            </w:r>
-            <m:oMath>
-              <m:r>
-                <m:rPr>
-                  <m:sty m:val="p"/>
-                </m:rPr>
-                <m:t>−</m:t>
-              </m:r>
-            </m:oMath>
-            <w:r>
-              <w:rPr>
-                <w:rFonts w:ascii="Times New Roman" w:hAnsi="Times New Roman"/>
-                <w:sz w:val="16"/>
-              </w:rPr>
-              <w:t xml:space="preserve">SOH)</w:t>
+                <w:b/>
+                <w:bCs/>
+                <w:sz w:val="16"/>
+              </w:rPr>
+              <w:t xml:space="preserve">Oxford no SOH</w:t>
+            </w:r>
+          </w:p>
+        </w:tc>
+        <w:tc>
+          <w:tcPr>
+            <w:tcBorders>
+              <w:bottom w:val="single" w:sz="6" w:color="000000"/>
+            </w:tcBorders>
+          </w:tcPr>
+          <w:p>
+            <w:pPr>
+              <w:pStyle w:val="Compact"/>
+              <w:spacing w:after="20" w:before="20"/>
+              <w:jc w:val="center"/>
+            </w:pPr>
+            <w:r>
+              <w:rPr>
+                <w:rFonts w:ascii="Times New Roman" w:hAnsi="Times New Roman"/>
+                <w:b/>
+                <w:bCs/>
+                <w:sz w:val="16"/>
+              </w:rPr>
+              <w:t xml:space="preserve">Severson w/ SOH</w:t>
+            </w:r>
+          </w:p>
+        </w:tc>
+        <w:tc>
+          <w:tcPr>
+            <w:tcBorders>
+              <w:bottom w:val="single" w:sz="6" w:color="000000"/>
+            </w:tcBorders>
+          </w:tcPr>
+          <w:p>
+            <w:pPr>
+              <w:pStyle w:val="Compact"/>
+              <w:spacing w:after="20" w:before="20"/>
+              <w:jc w:val="center"/>
+            </w:pPr>
+            <w:r>
+              <w:rPr>
+                <w:rFonts w:ascii="Times New Roman" w:hAnsi="Times New Roman"/>
+                <w:b/>
+                <w:bCs/>
+                <w:sz w:val="16"/>
+              </w:rPr>
+              <w:t xml:space="preserve">Severson no SOH</w:t>
             </w:r>
           </w:p>
         </w:tc>
@@ -6422,24 +6403,58 @@
                 <w:rFonts w:ascii="Times New Roman" w:hAnsi="Times New Roman"/>
                 <w:sz w:val="16"/>
               </w:rPr>
-              <w:t xml:space="preserve">0.957 / 0.518</w:t>
-            </w:r>
-          </w:p>
-        </w:tc>
-        <w:tc>
-          <w:tcPr/>
-          <w:p>
-            <w:pPr>
-              <w:pStyle w:val="Compact"/>
-              <w:spacing w:after="20" w:before="20"/>
-              <w:jc w:val="center"/>
-            </w:pPr>
-            <w:r>
-              <w:rPr>
-                <w:rFonts w:ascii="Times New Roman" w:hAnsi="Times New Roman"/>
-                <w:sz w:val="16"/>
-              </w:rPr>
-              <w:t xml:space="preserve">0.871 / 0.595</w:t>
+              <w:t xml:space="preserve">0.957</w:t>
+            </w:r>
+          </w:p>
+        </w:tc>
+        <w:tc>
+          <w:tcPr/>
+          <w:p>
+            <w:pPr>
+              <w:pStyle w:val="Compact"/>
+              <w:spacing w:after="20" w:before="20"/>
+              <w:jc w:val="center"/>
+            </w:pPr>
+            <w:r>
+              <w:rPr>
+                <w:rFonts w:ascii="Times New Roman" w:hAnsi="Times New Roman"/>
+                <w:sz w:val="16"/>
+              </w:rPr>
+              <w:t xml:space="preserve">0.518</w:t>
+            </w:r>
+          </w:p>
+        </w:tc>
+        <w:tc>
+          <w:tcPr/>
+          <w:p>
+            <w:pPr>
+              <w:pStyle w:val="Compact"/>
+              <w:spacing w:after="20" w:before="20"/>
+              <w:jc w:val="center"/>
+            </w:pPr>
+            <w:r>
+              <w:rPr>
+                <w:rFonts w:ascii="Times New Roman" w:hAnsi="Times New Roman"/>
+                <w:sz w:val="16"/>
+              </w:rPr>
+              <w:t xml:space="preserve">0.871</w:t>
+            </w:r>
+          </w:p>
+        </w:tc>
+        <w:tc>
+          <w:tcPr/>
+          <w:p>
+            <w:pPr>
+              <w:pStyle w:val="Compact"/>
+              <w:spacing w:after="20" w:before="20"/>
+              <w:jc w:val="center"/>
+            </w:pPr>
+            <w:r>
+              <w:rPr>
+                <w:rFonts w:ascii="Times New Roman" w:hAnsi="Times New Roman"/>
+                <w:sz w:val="16"/>
+              </w:rPr>
+              <w:t xml:space="preserve">0.595</w:t>
             </w:r>
           </w:p>
         </w:tc>
@@ -6492,24 +6507,58 @@
                 <w:rFonts w:ascii="Times New Roman" w:hAnsi="Times New Roman"/>
                 <w:sz w:val="16"/>
               </w:rPr>
-              <w:t xml:space="preserve">1.000 / 0.533</w:t>
-            </w:r>
-          </w:p>
-        </w:tc>
-        <w:tc>
-          <w:tcPr/>
-          <w:p>
-            <w:pPr>
-              <w:pStyle w:val="Compact"/>
-              <w:spacing w:after="20" w:before="20"/>
-              <w:jc w:val="center"/>
-            </w:pPr>
-            <w:r>
-              <w:rPr>
-                <w:rFonts w:ascii="Times New Roman" w:hAnsi="Times New Roman"/>
-                <w:sz w:val="16"/>
-              </w:rPr>
-              <w:t xml:space="preserve">0.849 / 0.527</w:t>
+              <w:t xml:space="preserve">1.000</w:t>
+            </w:r>
+          </w:p>
+        </w:tc>
+        <w:tc>
+          <w:tcPr/>
+          <w:p>
+            <w:pPr>
+              <w:pStyle w:val="Compact"/>
+              <w:spacing w:after="20" w:before="20"/>
+              <w:jc w:val="center"/>
+            </w:pPr>
+            <w:r>
+              <w:rPr>
+                <w:rFonts w:ascii="Times New Roman" w:hAnsi="Times New Roman"/>
+                <w:sz w:val="16"/>
+              </w:rPr>
+              <w:t xml:space="preserve">0.533</w:t>
+            </w:r>
+          </w:p>
+        </w:tc>
+        <w:tc>
+          <w:tcPr/>
+          <w:p>
+            <w:pPr>
+              <w:pStyle w:val="Compact"/>
+              <w:spacing w:after="20" w:before="20"/>
+              <w:jc w:val="center"/>
+            </w:pPr>
+            <w:r>
+              <w:rPr>
+                <w:rFonts w:ascii="Times New Roman" w:hAnsi="Times New Roman"/>
+                <w:sz w:val="16"/>
+              </w:rPr>
+              <w:t xml:space="preserve">0.849</w:t>
+            </w:r>
+          </w:p>
+        </w:tc>
+        <w:tc>
+          <w:tcPr/>
+          <w:p>
+            <w:pPr>
+              <w:pStyle w:val="Compact"/>
+              <w:spacing w:after="20" w:before="20"/>
+              <w:jc w:val="center"/>
+            </w:pPr>
+            <w:r>
+              <w:rPr>
+                <w:rFonts w:ascii="Times New Roman" w:hAnsi="Times New Roman"/>
+                <w:sz w:val="16"/>
+              </w:rPr>
+              <w:t xml:space="preserve">0.527</w:t>
             </w:r>
           </w:p>
         </w:tc>
@@ -6562,24 +6611,58 @@
                 <w:rFonts w:ascii="Times New Roman" w:hAnsi="Times New Roman"/>
                 <w:sz w:val="16"/>
               </w:rPr>
-              <w:t xml:space="preserve">1.000 / 0.521</w:t>
-            </w:r>
-          </w:p>
-        </w:tc>
-        <w:tc>
-          <w:tcPr/>
-          <w:p>
-            <w:pPr>
-              <w:pStyle w:val="Compact"/>
-              <w:spacing w:after="20" w:before="20"/>
-              <w:jc w:val="center"/>
-            </w:pPr>
-            <w:r>
-              <w:rPr>
-                <w:rFonts w:ascii="Times New Roman" w:hAnsi="Times New Roman"/>
-                <w:sz w:val="16"/>
-              </w:rPr>
-              <w:t xml:space="preserve">0.861 / 0.674</w:t>
+              <w:t xml:space="preserve">1.000</w:t>
+            </w:r>
+          </w:p>
+        </w:tc>
+        <w:tc>
+          <w:tcPr/>
+          <w:p>
+            <w:pPr>
+              <w:pStyle w:val="Compact"/>
+              <w:spacing w:after="20" w:before="20"/>
+              <w:jc w:val="center"/>
+            </w:pPr>
+            <w:r>
+              <w:rPr>
+                <w:rFonts w:ascii="Times New Roman" w:hAnsi="Times New Roman"/>
+                <w:sz w:val="16"/>
+              </w:rPr>
+              <w:t xml:space="preserve">0.521</w:t>
+            </w:r>
+          </w:p>
+        </w:tc>
+        <w:tc>
+          <w:tcPr/>
+          <w:p>
+            <w:pPr>
+              <w:pStyle w:val="Compact"/>
+              <w:spacing w:after="20" w:before="20"/>
+              <w:jc w:val="center"/>
+            </w:pPr>
+            <w:r>
+              <w:rPr>
+                <w:rFonts w:ascii="Times New Roman" w:hAnsi="Times New Roman"/>
+                <w:sz w:val="16"/>
+              </w:rPr>
+              <w:t xml:space="preserve">0.861</w:t>
+            </w:r>
+          </w:p>
+        </w:tc>
+        <w:tc>
+          <w:tcPr/>
+          <w:p>
+            <w:pPr>
+              <w:pStyle w:val="Compact"/>
+              <w:spacing w:after="20" w:before="20"/>
+              <w:jc w:val="center"/>
+            </w:pPr>
+            <w:r>
+              <w:rPr>
+                <w:rFonts w:ascii="Times New Roman" w:hAnsi="Times New Roman"/>
+                <w:sz w:val="16"/>
+              </w:rPr>
+              <w:t xml:space="preserve">0.674</w:t>
             </w:r>
           </w:p>
         </w:tc>
@@ -6632,24 +6715,58 @@
                 <w:rFonts w:ascii="Times New Roman" w:hAnsi="Times New Roman"/>
                 <w:sz w:val="16"/>
               </w:rPr>
-              <w:t xml:space="preserve">0.143 / 0.152</w:t>
-            </w:r>
-          </w:p>
-        </w:tc>
-        <w:tc>
-          <w:tcPr/>
-          <w:p>
-            <w:pPr>
-              <w:pStyle w:val="Compact"/>
-              <w:spacing w:after="20" w:before="20"/>
-              <w:jc w:val="center"/>
-            </w:pPr>
-            <w:r>
-              <w:rPr>
-                <w:rFonts w:ascii="Times New Roman" w:hAnsi="Times New Roman"/>
-                <w:sz w:val="16"/>
-              </w:rPr>
-              <w:t xml:space="preserve">0.832 / 0.766</w:t>
+              <w:t xml:space="preserve">0.143</w:t>
+            </w:r>
+          </w:p>
+        </w:tc>
+        <w:tc>
+          <w:tcPr/>
+          <w:p>
+            <w:pPr>
+              <w:pStyle w:val="Compact"/>
+              <w:spacing w:after="20" w:before="20"/>
+              <w:jc w:val="center"/>
+            </w:pPr>
+            <w:r>
+              <w:rPr>
+                <w:rFonts w:ascii="Times New Roman" w:hAnsi="Times New Roman"/>
+                <w:sz w:val="16"/>
+              </w:rPr>
+              <w:t xml:space="preserve">0.152</w:t>
+            </w:r>
+          </w:p>
+        </w:tc>
+        <w:tc>
+          <w:tcPr/>
+          <w:p>
+            <w:pPr>
+              <w:pStyle w:val="Compact"/>
+              <w:spacing w:after="20" w:before="20"/>
+              <w:jc w:val="center"/>
+            </w:pPr>
+            <w:r>
+              <w:rPr>
+                <w:rFonts w:ascii="Times New Roman" w:hAnsi="Times New Roman"/>
+                <w:sz w:val="16"/>
+              </w:rPr>
+              <w:t xml:space="preserve">0.832</w:t>
+            </w:r>
+          </w:p>
+        </w:tc>
+        <w:tc>
+          <w:tcPr/>
+          <w:p>
+            <w:pPr>
+              <w:pStyle w:val="Compact"/>
+              <w:spacing w:after="20" w:before="20"/>
+              <w:jc w:val="center"/>
+            </w:pPr>
+            <w:r>
+              <w:rPr>
+                <w:rFonts w:ascii="Times New Roman" w:hAnsi="Times New Roman"/>
+                <w:sz w:val="16"/>
+              </w:rPr>
+              <w:t xml:space="preserve">0.766</w:t>
             </w:r>
           </w:p>
         </w:tc>
@@ -6702,24 +6819,58 @@
                 <w:rFonts w:ascii="Times New Roman" w:hAnsi="Times New Roman"/>
                 <w:sz w:val="16"/>
               </w:rPr>
-              <w:t xml:space="preserve">0.850 / 0.416</w:t>
-            </w:r>
-          </w:p>
-        </w:tc>
-        <w:tc>
-          <w:tcPr/>
-          <w:p>
-            <w:pPr>
-              <w:pStyle w:val="Compact"/>
-              <w:spacing w:after="20" w:before="20"/>
-              <w:jc w:val="center"/>
-            </w:pPr>
-            <w:r>
-              <w:rPr>
-                <w:rFonts w:ascii="Times New Roman" w:hAnsi="Times New Roman"/>
-                <w:sz w:val="16"/>
-              </w:rPr>
-              <w:t xml:space="preserve">0.850 / 0.682</w:t>
+              <w:t xml:space="preserve">0.850</w:t>
+            </w:r>
+          </w:p>
+        </w:tc>
+        <w:tc>
+          <w:tcPr/>
+          <w:p>
+            <w:pPr>
+              <w:pStyle w:val="Compact"/>
+              <w:spacing w:after="20" w:before="20"/>
+              <w:jc w:val="center"/>
+            </w:pPr>
+            <w:r>
+              <w:rPr>
+                <w:rFonts w:ascii="Times New Roman" w:hAnsi="Times New Roman"/>
+                <w:sz w:val="16"/>
+              </w:rPr>
+              <w:t xml:space="preserve">0.416</w:t>
+            </w:r>
+          </w:p>
+        </w:tc>
+        <w:tc>
+          <w:tcPr/>
+          <w:p>
+            <w:pPr>
+              <w:pStyle w:val="Compact"/>
+              <w:spacing w:after="20" w:before="20"/>
+              <w:jc w:val="center"/>
+            </w:pPr>
+            <w:r>
+              <w:rPr>
+                <w:rFonts w:ascii="Times New Roman" w:hAnsi="Times New Roman"/>
+                <w:sz w:val="16"/>
+              </w:rPr>
+              <w:t xml:space="preserve">0.850</w:t>
+            </w:r>
+          </w:p>
+        </w:tc>
+        <w:tc>
+          <w:tcPr/>
+          <w:p>
+            <w:pPr>
+              <w:pStyle w:val="Compact"/>
+              <w:spacing w:after="20" w:before="20"/>
+              <w:jc w:val="center"/>
+            </w:pPr>
+            <w:r>
+              <w:rPr>
+                <w:rFonts w:ascii="Times New Roman" w:hAnsi="Times New Roman"/>
+                <w:sz w:val="16"/>
+              </w:rPr>
+              <w:t xml:space="preserve">0.682</w:t>
             </w:r>
           </w:p>
         </w:tc>
@@ -6772,24 +6923,58 @@
                 <w:rFonts w:ascii="Times New Roman" w:hAnsi="Times New Roman"/>
                 <w:sz w:val="16"/>
               </w:rPr>
-              <w:t xml:space="preserve">0.889 / 0.462</w:t>
-            </w:r>
-          </w:p>
-        </w:tc>
-        <w:tc>
-          <w:tcPr/>
-          <w:p>
-            <w:pPr>
-              <w:pStyle w:val="Compact"/>
-              <w:spacing w:after="20" w:before="20"/>
-              <w:jc w:val="center"/>
-            </w:pPr>
-            <w:r>
-              <w:rPr>
-                <w:rFonts w:ascii="Times New Roman" w:hAnsi="Times New Roman"/>
-                <w:sz w:val="16"/>
-              </w:rPr>
-              <w:t xml:space="preserve">0.863 / 0.643</w:t>
+              <w:t xml:space="preserve">0.889</w:t>
+            </w:r>
+          </w:p>
+        </w:tc>
+        <w:tc>
+          <w:tcPr/>
+          <w:p>
+            <w:pPr>
+              <w:pStyle w:val="Compact"/>
+              <w:spacing w:after="20" w:before="20"/>
+              <w:jc w:val="center"/>
+            </w:pPr>
+            <w:r>
+              <w:rPr>
+                <w:rFonts w:ascii="Times New Roman" w:hAnsi="Times New Roman"/>
+                <w:sz w:val="16"/>
+              </w:rPr>
+              <w:t xml:space="preserve">0.462</w:t>
+            </w:r>
+          </w:p>
+        </w:tc>
+        <w:tc>
+          <w:tcPr/>
+          <w:p>
+            <w:pPr>
+              <w:pStyle w:val="Compact"/>
+              <w:spacing w:after="20" w:before="20"/>
+              <w:jc w:val="center"/>
+            </w:pPr>
+            <w:r>
+              <w:rPr>
+                <w:rFonts w:ascii="Times New Roman" w:hAnsi="Times New Roman"/>
+                <w:sz w:val="16"/>
+              </w:rPr>
+              <w:t xml:space="preserve">0.863</w:t>
+            </w:r>
+          </w:p>
+        </w:tc>
+        <w:tc>
+          <w:tcPr/>
+          <w:p>
+            <w:pPr>
+              <w:pStyle w:val="Compact"/>
+              <w:spacing w:after="20" w:before="20"/>
+              <w:jc w:val="center"/>
+            </w:pPr>
+            <w:r>
+              <w:rPr>
+                <w:rFonts w:ascii="Times New Roman" w:hAnsi="Times New Roman"/>
+                <w:sz w:val="16"/>
+              </w:rPr>
+              <w:t xml:space="preserve">0.643</w:t>
             </w:r>
           </w:p>
         </w:tc>
@@ -6842,24 +7027,58 @@
                 <w:rFonts w:ascii="Times New Roman" w:hAnsi="Times New Roman"/>
                 <w:sz w:val="16"/>
               </w:rPr>
-              <w:t xml:space="preserve">0.850 / 0.501</w:t>
-            </w:r>
-          </w:p>
-        </w:tc>
-        <w:tc>
-          <w:tcPr/>
-          <w:p>
-            <w:pPr>
-              <w:pStyle w:val="Compact"/>
-              <w:spacing w:after="20" w:before="20"/>
-              <w:jc w:val="center"/>
-            </w:pPr>
-            <w:r>
-              <w:rPr>
-                <w:rFonts w:ascii="Times New Roman" w:hAnsi="Times New Roman"/>
-                <w:sz w:val="16"/>
-              </w:rPr>
-              <w:t xml:space="preserve">0.902 / 0.665</w:t>
+              <w:t xml:space="preserve">0.850</w:t>
+            </w:r>
+          </w:p>
+        </w:tc>
+        <w:tc>
+          <w:tcPr/>
+          <w:p>
+            <w:pPr>
+              <w:pStyle w:val="Compact"/>
+              <w:spacing w:after="20" w:before="20"/>
+              <w:jc w:val="center"/>
+            </w:pPr>
+            <w:r>
+              <w:rPr>
+                <w:rFonts w:ascii="Times New Roman" w:hAnsi="Times New Roman"/>
+                <w:sz w:val="16"/>
+              </w:rPr>
+              <w:t xml:space="preserve">0.501</w:t>
+            </w:r>
+          </w:p>
+        </w:tc>
+        <w:tc>
+          <w:tcPr/>
+          <w:p>
+            <w:pPr>
+              <w:pStyle w:val="Compact"/>
+              <w:spacing w:after="20" w:before="20"/>
+              <w:jc w:val="center"/>
+            </w:pPr>
+            <w:r>
+              <w:rPr>
+                <w:rFonts w:ascii="Times New Roman" w:hAnsi="Times New Roman"/>
+                <w:sz w:val="16"/>
+              </w:rPr>
+              <w:t xml:space="preserve">0.902</w:t>
+            </w:r>
+          </w:p>
+        </w:tc>
+        <w:tc>
+          <w:tcPr/>
+          <w:p>
+            <w:pPr>
+              <w:pStyle w:val="Compact"/>
+              <w:spacing w:after="20" w:before="20"/>
+              <w:jc w:val="center"/>
+            </w:pPr>
+            <w:r>
+              <w:rPr>
+                <w:rFonts w:ascii="Times New Roman" w:hAnsi="Times New Roman"/>
+                <w:sz w:val="16"/>
+              </w:rPr>
+              <w:t xml:space="preserve">0.665</w:t>
             </w:r>
           </w:p>
         </w:tc>
@@ -6912,24 +7131,58 @@
                 <w:rFonts w:ascii="Times New Roman" w:hAnsi="Times New Roman"/>
                 <w:sz w:val="16"/>
               </w:rPr>
-              <w:t xml:space="preserve">0.120 / 0.100</w:t>
-            </w:r>
-          </w:p>
-        </w:tc>
-        <w:tc>
-          <w:tcPr/>
-          <w:p>
-            <w:pPr>
-              <w:pStyle w:val="Compact"/>
-              <w:spacing w:after="20" w:before="20"/>
-              <w:jc w:val="center"/>
-            </w:pPr>
-            <w:r>
-              <w:rPr>
-                <w:rFonts w:ascii="Times New Roman" w:hAnsi="Times New Roman"/>
-                <w:sz w:val="16"/>
-              </w:rPr>
-              <w:t xml:space="preserve">0.777 / 0.524</w:t>
+              <w:t xml:space="preserve">0.120</w:t>
+            </w:r>
+          </w:p>
+        </w:tc>
+        <w:tc>
+          <w:tcPr/>
+          <w:p>
+            <w:pPr>
+              <w:pStyle w:val="Compact"/>
+              <w:spacing w:after="20" w:before="20"/>
+              <w:jc w:val="center"/>
+            </w:pPr>
+            <w:r>
+              <w:rPr>
+                <w:rFonts w:ascii="Times New Roman" w:hAnsi="Times New Roman"/>
+                <w:sz w:val="16"/>
+              </w:rPr>
+              <w:t xml:space="preserve">0.100</w:t>
+            </w:r>
+          </w:p>
+        </w:tc>
+        <w:tc>
+          <w:tcPr/>
+          <w:p>
+            <w:pPr>
+              <w:pStyle w:val="Compact"/>
+              <w:spacing w:after="20" w:before="20"/>
+              <w:jc w:val="center"/>
+            </w:pPr>
+            <w:r>
+              <w:rPr>
+                <w:rFonts w:ascii="Times New Roman" w:hAnsi="Times New Roman"/>
+                <w:sz w:val="16"/>
+              </w:rPr>
+              <w:t xml:space="preserve">0.777</w:t>
+            </w:r>
+          </w:p>
+        </w:tc>
+        <w:tc>
+          <w:tcPr/>
+          <w:p>
+            <w:pPr>
+              <w:pStyle w:val="Compact"/>
+              <w:spacing w:after="20" w:before="20"/>
+              <w:jc w:val="center"/>
+            </w:pPr>
+            <w:r>
+              <w:rPr>
+                <w:rFonts w:ascii="Times New Roman" w:hAnsi="Times New Roman"/>
+                <w:sz w:val="16"/>
+              </w:rPr>
+              <w:t xml:space="preserve">0.524</w:t>
             </w:r>
           </w:p>
         </w:tc>
@@ -6982,24 +7235,58 @@
                 <w:rFonts w:ascii="Times New Roman" w:hAnsi="Times New Roman"/>
                 <w:sz w:val="16"/>
               </w:rPr>
-              <w:t xml:space="preserve">0.917 / 0.429</w:t>
-            </w:r>
-          </w:p>
-        </w:tc>
-        <w:tc>
-          <w:tcPr/>
-          <w:p>
-            <w:pPr>
-              <w:pStyle w:val="Compact"/>
-              <w:spacing w:after="20" w:before="20"/>
-              <w:jc w:val="center"/>
-            </w:pPr>
-            <w:r>
-              <w:rPr>
-                <w:rFonts w:ascii="Times New Roman" w:hAnsi="Times New Roman"/>
-                <w:sz w:val="16"/>
-              </w:rPr>
-              <w:t xml:space="preserve">0.896 / 0.750</w:t>
+              <w:t xml:space="preserve">0.917</w:t>
+            </w:r>
+          </w:p>
+        </w:tc>
+        <w:tc>
+          <w:tcPr/>
+          <w:p>
+            <w:pPr>
+              <w:pStyle w:val="Compact"/>
+              <w:spacing w:after="20" w:before="20"/>
+              <w:jc w:val="center"/>
+            </w:pPr>
+            <w:r>
+              <w:rPr>
+                <w:rFonts w:ascii="Times New Roman" w:hAnsi="Times New Roman"/>
+                <w:sz w:val="16"/>
+              </w:rPr>
+              <w:t xml:space="preserve">0.429</w:t>
+            </w:r>
+          </w:p>
+        </w:tc>
+        <w:tc>
+          <w:tcPr/>
+          <w:p>
+            <w:pPr>
+              <w:pStyle w:val="Compact"/>
+              <w:spacing w:after="20" w:before="20"/>
+              <w:jc w:val="center"/>
+            </w:pPr>
+            <w:r>
+              <w:rPr>
+                <w:rFonts w:ascii="Times New Roman" w:hAnsi="Times New Roman"/>
+                <w:sz w:val="16"/>
+              </w:rPr>
+              <w:t xml:space="preserve">0.896</w:t>
+            </w:r>
+          </w:p>
+        </w:tc>
+        <w:tc>
+          <w:tcPr/>
+          <w:p>
+            <w:pPr>
+              <w:pStyle w:val="Compact"/>
+              <w:spacing w:after="20" w:before="20"/>
+              <w:jc w:val="center"/>
+            </w:pPr>
+            <w:r>
+              <w:rPr>
+                <w:rFonts w:ascii="Times New Roman" w:hAnsi="Times New Roman"/>
+                <w:sz w:val="16"/>
+              </w:rPr>
+              <w:t xml:space="preserve">0.750</w:t>
             </w:r>
           </w:p>
         </w:tc>
@@ -7052,24 +7339,58 @@
                 <w:rFonts w:ascii="Times New Roman" w:hAnsi="Times New Roman"/>
                 <w:sz w:val="16"/>
               </w:rPr>
-              <w:t xml:space="preserve">0.971 / 0.332</w:t>
-            </w:r>
-          </w:p>
-        </w:tc>
-        <w:tc>
-          <w:tcPr/>
-          <w:p>
-            <w:pPr>
-              <w:pStyle w:val="Compact"/>
-              <w:spacing w:after="20" w:before="20"/>
-              <w:jc w:val="center"/>
-            </w:pPr>
-            <w:r>
-              <w:rPr>
-                <w:rFonts w:ascii="Times New Roman" w:hAnsi="Times New Roman"/>
-                <w:sz w:val="16"/>
-              </w:rPr>
-              <w:t xml:space="preserve">0.882 / 0.718</w:t>
+              <w:t xml:space="preserve">0.971</w:t>
+            </w:r>
+          </w:p>
+        </w:tc>
+        <w:tc>
+          <w:tcPr/>
+          <w:p>
+            <w:pPr>
+              <w:pStyle w:val="Compact"/>
+              <w:spacing w:after="20" w:before="20"/>
+              <w:jc w:val="center"/>
+            </w:pPr>
+            <w:r>
+              <w:rPr>
+                <w:rFonts w:ascii="Times New Roman" w:hAnsi="Times New Roman"/>
+                <w:sz w:val="16"/>
+              </w:rPr>
+              <w:t xml:space="preserve">0.332</w:t>
+            </w:r>
+          </w:p>
+        </w:tc>
+        <w:tc>
+          <w:tcPr/>
+          <w:p>
+            <w:pPr>
+              <w:pStyle w:val="Compact"/>
+              <w:spacing w:after="20" w:before="20"/>
+              <w:jc w:val="center"/>
+            </w:pPr>
+            <w:r>
+              <w:rPr>
+                <w:rFonts w:ascii="Times New Roman" w:hAnsi="Times New Roman"/>
+                <w:sz w:val="16"/>
+              </w:rPr>
+              <w:t xml:space="preserve">0.882</w:t>
+            </w:r>
+          </w:p>
+        </w:tc>
+        <w:tc>
+          <w:tcPr/>
+          <w:p>
+            <w:pPr>
+              <w:pStyle w:val="Compact"/>
+              <w:spacing w:after="20" w:before="20"/>
+              <w:jc w:val="center"/>
+            </w:pPr>
+            <w:r>
+              <w:rPr>
+                <w:rFonts w:ascii="Times New Roman" w:hAnsi="Times New Roman"/>
+                <w:sz w:val="16"/>
+              </w:rPr>
+              <w:t xml:space="preserve">0.718</w:t>
             </w:r>
           </w:p>
         </w:tc>
@@ -7122,24 +7443,58 @@
                 <w:rFonts w:ascii="Times New Roman" w:hAnsi="Times New Roman"/>
                 <w:sz w:val="16"/>
               </w:rPr>
-              <w:t xml:space="preserve">0.989 / 0.581</w:t>
-            </w:r>
-          </w:p>
-        </w:tc>
-        <w:tc>
-          <w:tcPr/>
-          <w:p>
-            <w:pPr>
-              <w:pStyle w:val="Compact"/>
-              <w:spacing w:after="20" w:before="20"/>
-              <w:jc w:val="center"/>
-            </w:pPr>
-            <w:r>
-              <w:rPr>
-                <w:rFonts w:ascii="Times New Roman" w:hAnsi="Times New Roman"/>
-                <w:sz w:val="16"/>
-              </w:rPr>
-              <w:t xml:space="preserve">0.889 / 0.746</w:t>
+              <w:t xml:space="preserve">0.989</w:t>
+            </w:r>
+          </w:p>
+        </w:tc>
+        <w:tc>
+          <w:tcPr/>
+          <w:p>
+            <w:pPr>
+              <w:pStyle w:val="Compact"/>
+              <w:spacing w:after="20" w:before="20"/>
+              <w:jc w:val="center"/>
+            </w:pPr>
+            <w:r>
+              <w:rPr>
+                <w:rFonts w:ascii="Times New Roman" w:hAnsi="Times New Roman"/>
+                <w:sz w:val="16"/>
+              </w:rPr>
+              <w:t xml:space="preserve">0.581</w:t>
+            </w:r>
+          </w:p>
+        </w:tc>
+        <w:tc>
+          <w:tcPr/>
+          <w:p>
+            <w:pPr>
+              <w:pStyle w:val="Compact"/>
+              <w:spacing w:after="20" w:before="20"/>
+              <w:jc w:val="center"/>
+            </w:pPr>
+            <w:r>
+              <w:rPr>
+                <w:rFonts w:ascii="Times New Roman" w:hAnsi="Times New Roman"/>
+                <w:sz w:val="16"/>
+              </w:rPr>
+              <w:t xml:space="preserve">0.889</w:t>
+            </w:r>
+          </w:p>
+        </w:tc>
+        <w:tc>
+          <w:tcPr/>
+          <w:p>
+            <w:pPr>
+              <w:pStyle w:val="Compact"/>
+              <w:spacing w:after="20" w:before="20"/>
+              <w:jc w:val="center"/>
+            </w:pPr>
+            <w:r>
+              <w:rPr>
+                <w:rFonts w:ascii="Times New Roman" w:hAnsi="Times New Roman"/>
+                <w:sz w:val="16"/>
+              </w:rPr>
+              <w:t xml:space="preserve">0.746</w:t>
             </w:r>
           </w:p>
         </w:tc>
@@ -7192,24 +7547,58 @@
                 <w:rFonts w:ascii="Times New Roman" w:hAnsi="Times New Roman"/>
                 <w:sz w:val="16"/>
               </w:rPr>
-              <w:t xml:space="preserve">0.053 / 0.015</w:t>
-            </w:r>
-          </w:p>
-        </w:tc>
-        <w:tc>
-          <w:tcPr/>
-          <w:p>
-            <w:pPr>
-              <w:pStyle w:val="Compact"/>
-              <w:spacing w:after="20" w:before="20"/>
-              <w:jc w:val="center"/>
-            </w:pPr>
-            <w:r>
-              <w:rPr>
-                <w:rFonts w:ascii="Times New Roman" w:hAnsi="Times New Roman"/>
-                <w:sz w:val="16"/>
-              </w:rPr>
-              <w:t xml:space="preserve">0.799 / 0.748</w:t>
+              <w:t xml:space="preserve">0.053</w:t>
+            </w:r>
+          </w:p>
+        </w:tc>
+        <w:tc>
+          <w:tcPr/>
+          <w:p>
+            <w:pPr>
+              <w:pStyle w:val="Compact"/>
+              <w:spacing w:after="20" w:before="20"/>
+              <w:jc w:val="center"/>
+            </w:pPr>
+            <w:r>
+              <w:rPr>
+                <w:rFonts w:ascii="Times New Roman" w:hAnsi="Times New Roman"/>
+                <w:sz w:val="16"/>
+              </w:rPr>
+              <w:t xml:space="preserve">0.015</w:t>
+            </w:r>
+          </w:p>
+        </w:tc>
+        <w:tc>
+          <w:tcPr/>
+          <w:p>
+            <w:pPr>
+              <w:pStyle w:val="Compact"/>
+              <w:spacing w:after="20" w:before="20"/>
+              <w:jc w:val="center"/>
+            </w:pPr>
+            <w:r>
+              <w:rPr>
+                <w:rFonts w:ascii="Times New Roman" w:hAnsi="Times New Roman"/>
+                <w:sz w:val="16"/>
+              </w:rPr>
+              <w:t xml:space="preserve">0.799</w:t>
+            </w:r>
+          </w:p>
+        </w:tc>
+        <w:tc>
+          <w:tcPr/>
+          <w:p>
+            <w:pPr>
+              <w:pStyle w:val="Compact"/>
+              <w:spacing w:after="20" w:before="20"/>
+              <w:jc w:val="center"/>
+            </w:pPr>
+            <w:r>
+              <w:rPr>
+                <w:rFonts w:ascii="Times New Roman" w:hAnsi="Times New Roman"/>
+                <w:sz w:val="16"/>
+              </w:rPr>
+              <w:t xml:space="preserve">0.748</w:t>
             </w:r>
           </w:p>
         </w:tc>
@@ -7290,24 +7679,7 @@
         </m:r>
       </m:oMath>
       <w:r>
-        <w:t xml:space="preserve">: AUC drop from</w:t>
-      </w:r>
-      <w:r>
-        <w:t xml:space="preserve"> </w:t>
-      </w:r>
-      <w:r>
-        <w:t xml:space="preserve">removing SOH, per source</w:t>
-      </w:r>
-      <m:oMath>
-        <m:r>
-          <m:rPr>
-            <m:sty m:val="p"/>
-          </m:rPr>
-          <m:t>→</m:t>
-        </m:r>
-      </m:oMath>
-      <w:r>
-        <w:t xml:space="preserve">target pair and model.</w:t>
+        <w:t xml:space="preserve">.</w:t>
       </w:r>
     </w:p>
     <w:bookmarkEnd w:id="37"/>
@@ -7351,7 +7723,7 @@
         </m:r>
       </m:oMath>
       <w:r>
-        <w:t xml:space="preserve">, which involves no fitting at all: it transfers to</w:t>
+        <w:t xml:space="preserve">, which involves no fitting: it transfers to</w:t>
       </w:r>
       <w:r>
         <w:t xml:space="preserve"> </w:t>
@@ -7363,19 +7735,25 @@
         <w:t xml:space="preserve"> </w:t>
       </w:r>
       <w:r>
-        <w:t xml:space="preserve">source — within the confidence range of the tuned ensembles — so</w:t>
-      </w:r>
-      <w:r>
-        <w:t xml:space="preserve"> </w:t>
-      </w:r>
-      <w:r>
-        <w:t xml:space="preserve">most of the apparent transfer is the SOH coordinate itself. The</w:t>
-      </w:r>
-      <w:r>
-        <w:t xml:space="preserve"> </w:t>
-      </w:r>
-      <w:r>
-        <w:t xml:space="preserve">remaining controls are the subject of the next subsection.</w:t>
+        <w:t xml:space="preserve">source, within the confidence range of the tuned ensembles. Most of</w:t>
+      </w:r>
+      <w:r>
+        <w:t xml:space="preserve"> </w:t>
+      </w:r>
+      <w:r>
+        <w:t xml:space="preserve">the apparent transfer is therefore explained by the SOH coordinate</w:t>
+      </w:r>
+      <w:r>
+        <w:t xml:space="preserve"> </w:t>
+      </w:r>
+      <w:r>
+        <w:t xml:space="preserve">itself. The remaining controls are the subject of the next</w:t>
+      </w:r>
+      <w:r>
+        <w:t xml:space="preserve"> </w:t>
+      </w:r>
+      <w:r>
+        <w:t xml:space="preserve">subsection.</w:t>
       </w:r>
     </w:p>
     <w:bookmarkEnd w:id="38"/>
@@ -7399,7 +7777,7 @@
         <w:t xml:space="preserve"> </w:t>
       </w:r>
       <w:r>
-        <w:t xml:space="preserve">endpoint at a time — SOH</w:t>
+        <w:t xml:space="preserve">endpoint at a time (SOH</w:t>
       </w:r>
       <w:r>
         <w:t xml:space="preserve"> </w:t>
@@ -7419,82 +7797,49 @@
         <w:t xml:space="preserve"> </w:t>
       </w:r>
       <w:r>
-        <w:t xml:space="preserve">only, voltage sag only, or both</w:t>
-      </w:r>
-      <w:r>
-        <w:t xml:space="preserve"> </w:t>
-      </w:r>
-      <w:r>
-        <w:t xml:space="preserve">— and its signature is clean: with-SOH transfer</w:t>
-      </w:r>
-      <w:r>
-        <w:t xml:space="preserve"> </w:t>
-      </w:r>
-      <w:r>
-        <w:rPr>
-          <w:i/>
-          <w:iCs/>
-        </w:rPr>
-        <w:t xml:space="preserve">tracks how much</w:t>
-      </w:r>
-      <w:r>
-        <w:rPr>
-          <w:i/>
-          <w:iCs/>
-        </w:rPr>
-        <w:t xml:space="preserve"> </w:t>
-      </w:r>
-      <w:r>
-        <w:rPr>
-          <w:i/>
-          <w:iCs/>
-        </w:rPr>
-        <w:t xml:space="preserve">SOH defines the label</w:t>
-      </w:r>
-      <w:r>
-        <w:t xml:space="preserve">. Under an SOH-only label (the model is, in</w:t>
-      </w:r>
-      <w:r>
-        <w:t xml:space="preserve"> </w:t>
-      </w:r>
-      <w:r>
-        <w:t xml:space="preserve">effect, reading the label criterion) transfer to Severson saturates at</w:t>
-      </w:r>
-      <w:r>
-        <w:t xml:space="preserve"> </w:t>
-      </w:r>
-      <w:r>
-        <w:t xml:space="preserve">0.985; under the combined label it is 0.896; relabeling by voltage sag</w:t>
-      </w:r>
-      <w:r>
-        <w:t xml:space="preserve"> </w:t>
-      </w:r>
-      <w:r>
-        <w:t xml:space="preserve">alone, a criterion SOH takes no part in, cuts it to 0.723 — a drop of</w:t>
-      </w:r>
-      <w:r>
-        <w:t xml:space="preserve"> </w:t>
-      </w:r>
-      <w:r>
-        <w:t xml:space="preserve">roughly a quarter. The residual with-SOH advantage under the voltage</w:t>
-      </w:r>
-      <w:r>
-        <w:t xml:space="preserve"> </w:t>
-      </w:r>
-      <w:r>
-        <w:t xml:space="preserve">label (0.723 versus 0.611 without SOH) is consistent with genuine but</w:t>
-      </w:r>
-      <w:r>
-        <w:t xml:space="preserve"> </w:t>
-      </w:r>
-      <w:r>
-        <w:t xml:space="preserve">weak health-state information: cells far below nominal capacity do fail</w:t>
-      </w:r>
-      <w:r>
-        <w:t xml:space="preserve"> </w:t>
-      </w:r>
-      <w:r>
-        <w:t xml:space="preserve">sooner under almost any definition.</w:t>
+        <w:t xml:space="preserve">only, voltage sag only, or both).</w:t>
+      </w:r>
+      <w:r>
+        <w:t xml:space="preserve"> </w:t>
+      </w:r>
+      <w:r>
+        <w:t xml:space="preserve">With-SOH transfer increases with the share of SOH in the label</w:t>
+      </w:r>
+      <w:r>
+        <w:t xml:space="preserve"> </w:t>
+      </w:r>
+      <w:r>
+        <w:t xml:space="preserve">definition. Under an SOH-only label, transfer to Severson is 0.985;</w:t>
+      </w:r>
+      <w:r>
+        <w:t xml:space="preserve"> </w:t>
+      </w:r>
+      <w:r>
+        <w:t xml:space="preserve">under the combined label it is 0.896; under the voltage-sag label,</w:t>
+      </w:r>
+      <w:r>
+        <w:t xml:space="preserve"> </w:t>
+      </w:r>
+      <w:r>
+        <w:t xml:space="preserve">which SOH does not enter, it is 0.723. The residual with-SOH advantage</w:t>
+      </w:r>
+      <w:r>
+        <w:t xml:space="preserve"> </w:t>
+      </w:r>
+      <w:r>
+        <w:t xml:space="preserve">under the voltage label (0.723 versus 0.611 without SOH) indicates</w:t>
+      </w:r>
+      <w:r>
+        <w:t xml:space="preserve"> </w:t>
+      </w:r>
+      <w:r>
+        <w:t xml:space="preserve">genuine but weak health-state information: cells far below nominal</w:t>
+      </w:r>
+      <w:r>
+        <w:t xml:space="preserve"> </w:t>
+      </w:r>
+      <w:r>
+        <w:t xml:space="preserve">capacity fail sooner under almost any definition.</w:t>
       </w:r>
     </w:p>
     <w:bookmarkStart w:id="39" w:name="tab:faildef"/>
@@ -7526,13 +7871,7 @@
         <w:t xml:space="preserve"> </w:t>
       </w:r>
       <w:r>
-        <w:t xml:space="preserve">(XGBoost, ALL-LCO</w:t>
-      </w:r>
-      <w:r>
-        <w:t xml:space="preserve"> </w:t>
-      </w:r>
-      <w:r>
-        <w:t xml:space="preserve">Source): Pooled Raw AUC With and Without SOH as a Feature</w:t>
+        <w:t xml:space="preserve">(Pooled Raw AUC)</w:t>
       </w:r>
     </w:p>
     <w:tbl>
@@ -7540,7 +7879,7 @@
         <w:tblStyle w:val="Table"/>
         <w:tblW w:type="auto" w:w="0"/>
         <w:tblLook w:firstRow="1" w:lastRow="0" w:firstColumn="0" w:lastColumn="0" w:noHBand="0" w:noVBand="0" w:val="0020"/>
-        <w:tblCaption w:val="Failure-Definition Ablation at H{=}20 (XGBoost, ALL-LCO Source): Pooled Raw AUC With and Without SOH as a Feature"/>
+        <w:tblCaption w:val="Failure-Definition Ablation at H{=}20 (Pooled Raw AUC)"/>
         <w:tblBorders>
           <w:top w:val="single" w:sz="8" w:color="000000"/>
           <w:bottom w:val="single" w:sz="8" w:color="000000"/>
@@ -7576,6 +7915,8 @@
             <w:r>
               <w:rPr>
                 <w:rFonts w:ascii="Times New Roman" w:hAnsi="Times New Roman"/>
+                <w:b/>
+                <w:bCs/>
                 <w:sz w:val="16"/>
               </w:rPr>
               <w:t xml:space="preserve">Label endpoint</w:t>
@@ -7944,7 +8285,7 @@
         <w:pStyle w:val="TableCaption"/>
       </w:pPr>
       <w:r>
-        <w:t xml:space="preserve">Same-Chemistry Cross-Laboratory Controls at</w:t>
+        <w:t xml:space="preserve">Same-Chemistry Controls at</w:t>
       </w:r>
       <w:r>
         <w:t xml:space="preserve"> </w:t>
@@ -7967,7 +8308,7 @@
         <w:t xml:space="preserve"> </w:t>
       </w:r>
       <w:r>
-        <w:t xml:space="preserve">(XGBoost): Pooled Raw AUC With and Without SOH</w:t>
+        <w:t xml:space="preserve">(Pooled Raw AUC)</w:t>
       </w:r>
     </w:p>
     <w:tbl>
@@ -7975,7 +8316,7 @@
         <w:tblStyle w:val="Table"/>
         <w:tblW w:type="auto" w:w="0"/>
         <w:tblLook w:firstRow="1" w:lastRow="0" w:firstColumn="0" w:lastColumn="0" w:noHBand="0" w:noVBand="0" w:val="0020"/>
-        <w:tblCaption w:val="Same-Chemistry Cross-Laboratory Controls at H{=}20 (XGBoost): Pooled Raw AUC With and Without SOH"/>
+        <w:tblCaption w:val="Same-Chemistry Controls at H{=}20 (Pooled Raw AUC)"/>
         <w:tblBorders>
           <w:top w:val="single" w:sz="8" w:color="000000"/>
           <w:bottom w:val="single" w:sz="8" w:color="000000"/>
@@ -8009,6 +8350,8 @@
             <w:r>
               <w:rPr>
                 <w:rFonts w:ascii="Times New Roman" w:hAnsi="Times New Roman"/>
+                <w:b/>
+                <w:bCs/>
                 <w:sz w:val="16"/>
               </w:rPr>
               <w:t xml:space="preserve">Pair</w:t>
@@ -8030,6 +8373,8 @@
             <w:r>
               <w:rPr>
                 <w:rFonts w:ascii="Times New Roman" w:hAnsi="Times New Roman"/>
+                <w:b/>
+                <w:bCs/>
                 <w:sz w:val="16"/>
               </w:rPr>
               <w:t xml:space="preserve">w/ SOH</w:t>
@@ -8051,6 +8396,8 @@
             <w:r>
               <w:rPr>
                 <w:rFonts w:ascii="Times New Roman" w:hAnsi="Times New Roman"/>
+                <w:b/>
+                <w:bCs/>
                 <w:sz w:val="16"/>
               </w:rPr>
               <w:t xml:space="preserve">no SOH</w:t>
@@ -8420,19 +8767,19 @@
         </m:r>
       </m:oMath>
       <w:r>
-        <w:t xml:space="preserve">Oxford (both LFP) reproduces the full pattern of the</w:t>
-      </w:r>
-      <w:r>
-        <w:t xml:space="preserve"> </w:t>
-      </w:r>
-      <w:r>
-        <w:t xml:space="preserve">cross-chemistry shifts — 0.997 with SOH collapsing to 0.471 without,</w:t>
-      </w:r>
-      <w:r>
-        <w:t xml:space="preserve"> </w:t>
-      </w:r>
-      <w:r>
-        <w:t xml:space="preserve">an inverted 0.428 on the common feature set — and NASA</w:t>
+        <w:t xml:space="preserve">Oxford (both LFP) reproduces the pattern of the</w:t>
+      </w:r>
+      <w:r>
+        <w:t xml:space="preserve"> </w:t>
+      </w:r>
+      <w:r>
+        <w:t xml:space="preserve">cross-chemistry shifts: 0.997 with SOH falls to 0.471 without.</w:t>
+      </w:r>
+      <w:r>
+        <w:t xml:space="preserve"> </w:t>
+      </w:r>
+      <w:r>
+        <w:t xml:space="preserve">NASA</w:t>
       </w:r>
       <m:oMath>
         <m:r>
@@ -8443,19 +8790,19 @@
         </m:r>
       </m:oMath>
       <w:r>
-        <w:t xml:space="preserve">CALCE</w:t>
-      </w:r>
-      <w:r>
-        <w:t xml:space="preserve"> </w:t>
-      </w:r>
-      <w:r>
-        <w:t xml:space="preserve">(both LCO) behaves like the cross-chemistry pairs. Conversely,</w:t>
-      </w:r>
-      <w:r>
-        <w:t xml:space="preserve"> </w:t>
-      </w:r>
-      <w:r>
-        <w:t xml:space="preserve">CALCE</w:t>
+        <w:t xml:space="preserve">CALCE (both LCO) transfers partially even without SOH</w:t>
+      </w:r>
+      <w:r>
+        <w:t xml:space="preserve"> </w:t>
+      </w:r>
+      <w:r>
+        <w:t xml:space="preserve">(0.870 to 0.849), helped by the very different per-cell cycle lives of</w:t>
+      </w:r>
+      <w:r>
+        <w:t xml:space="preserve"> </w:t>
+      </w:r>
+      <w:r>
+        <w:t xml:space="preserve">the two datasets. Conversely, CALCE</w:t>
       </w:r>
       <m:oMath>
         <m:r>
@@ -8466,58 +8813,43 @@
         </m:r>
       </m:oMath>
       <w:r>
-        <w:t xml:space="preserve">NASA stays near chance even with SOH, showing that a small,</w:t>
-      </w:r>
-      <w:r>
-        <w:t xml:space="preserve"> </w:t>
-      </w:r>
-      <w:r>
-        <w:t xml:space="preserve">heterogeneous source limits transfer in both directions. The supported</w:t>
-      </w:r>
-      <w:r>
-        <w:t xml:space="preserve"> </w:t>
-      </w:r>
-      <w:r>
-        <w:t xml:space="preserve">conclusion is deliberately narrower than</w:t>
-      </w:r>
-      <w:r>
-        <w:t xml:space="preserve"> </w:t>
-      </w:r>
-      <w:r>
-        <w:t xml:space="preserve">“SOH is</w:t>
-      </w:r>
-      <w:r>
-        <w:t xml:space="preserve"> </w:t>
-      </w:r>
-      <w:r>
-        <w:t xml:space="preserve">chemistry-specific”</w:t>
-      </w:r>
-      <w:r>
-        <w:t xml:space="preserve">: much of the observed cross-dataset,</w:t>
-      </w:r>
-      <w:r>
-        <w:t xml:space="preserve"> </w:t>
-      </w:r>
-      <w:r>
-        <w:t xml:space="preserve">cross-chemistry discrimination is attributable to SOH, partly because</w:t>
-      </w:r>
-      <w:r>
-        <w:t xml:space="preserve"> </w:t>
-      </w:r>
-      <w:r>
-        <w:t xml:space="preserve">SOH defines the failure criterion itself, and same-chemistry controls</w:t>
-      </w:r>
-      <w:r>
-        <w:t xml:space="preserve"> </w:t>
-      </w:r>
-      <w:r>
-        <w:t xml:space="preserve">attribute the collapse to dataset shift at least as much as to</w:t>
-      </w:r>
-      <w:r>
-        <w:t xml:space="preserve"> </w:t>
-      </w:r>
-      <w:r>
-        <w:t xml:space="preserve">chemistry.</w:t>
+        <w:t xml:space="preserve">NASA stays near chance even</w:t>
+      </w:r>
+      <w:r>
+        <w:t xml:space="preserve"> </w:t>
+      </w:r>
+      <w:r>
+        <w:t xml:space="preserve">with SOH, showing that a small, heterogeneous source limits transfer</w:t>
+      </w:r>
+      <w:r>
+        <w:t xml:space="preserve"> </w:t>
+      </w:r>
+      <w:r>
+        <w:t xml:space="preserve">in both directions. Much of the observed</w:t>
+      </w:r>
+      <w:r>
+        <w:t xml:space="preserve"> </w:t>
+      </w:r>
+      <w:r>
+        <w:t xml:space="preserve">cross-dataset, cross-chemistry discrimination is therefore attributable</w:t>
+      </w:r>
+      <w:r>
+        <w:t xml:space="preserve"> </w:t>
+      </w:r>
+      <w:r>
+        <w:t xml:space="preserve">to SOH, partly because SOH defines the failure criterion itself, and</w:t>
+      </w:r>
+      <w:r>
+        <w:t xml:space="preserve"> </w:t>
+      </w:r>
+      <w:r>
+        <w:t xml:space="preserve">the same-chemistry controls attribute the collapse to dataset shift at</w:t>
+      </w:r>
+      <w:r>
+        <w:t xml:space="preserve"> </w:t>
+      </w:r>
+      <w:r>
+        <w:t xml:space="preserve">least as much as to chemistry.</w:t>
       </w:r>
     </w:p>
     <w:bookmarkEnd w:id="41"/>
@@ -8621,13 +8953,13 @@
         <w:t xml:space="preserve"> </w:t>
       </w:r>
       <w:r>
-        <w:t xml:space="preserve">independent classifiers, however, cumulative risk coherence is not</w:t>
-      </w:r>
-      <w:r>
-        <w:t xml:space="preserve"> </w:t>
-      </w:r>
-      <w:r>
-        <w:t xml:space="preserve">guaranteed: the requirement</w:t>
+        <w:t xml:space="preserve">independent classifiers, cumulative risk coherence is not guaranteed:</w:t>
+      </w:r>
+      <w:r>
+        <w:t xml:space="preserve"> </w:t>
+      </w:r>
+      <w:r>
+        <w:t xml:space="preserve">the requirement</w:t>
       </w:r>
       <w:r>
         <w:t xml:space="preserve"> </w:t>
@@ -8710,13 +9042,7 @@
         <w:t xml:space="preserve"> </w:t>
       </w:r>
       <w:r>
-        <w:t xml:space="preserve">on the transferred Severson target — for a hazard-style output, an</w:t>
-      </w:r>
-      <w:r>
-        <w:t xml:space="preserve"> </w:t>
-      </w:r>
-      <w:r>
-        <w:t xml:space="preserve">incoherent quantity to quote to an operator.</w:t>
+        <w:t xml:space="preserve">on the transferred Severson target.</w:t>
       </w:r>
     </w:p>
     <w:bookmarkStart w:id="42" w:name="tab:hazard"/>
@@ -8725,42 +9051,7 @@
         <w:pStyle w:val="TableCaption"/>
       </w:pPr>
       <w:r>
-        <w:t xml:space="preserve">Fixed-Horizon XGBoost Versus the Discrete-Time Hazard Model</w:t>
-      </w:r>
-      <w:r>
-        <w:t xml:space="preserve"> </w:t>
-      </w:r>
-      <w:r>
-        <w:t xml:space="preserve">(Survival Product), Fold-Mean AUC Within Dataset and Pooled Raw AUC on</w:t>
-      </w:r>
-      <w:r>
-        <w:t xml:space="preserve"> </w:t>
-      </w:r>
-      <w:r>
-        <w:t xml:space="preserve">Transfer at</w:t>
-      </w:r>
-      <w:r>
-        <w:t xml:space="preserve"> </w:t>
-      </w:r>
-      <m:oMath>
-        <m:r>
-          <m:t>H</m:t>
-        </m:r>
-        <m:r>
-          <m:rPr>
-            <m:sty m:val="p"/>
-          </m:rPr>
-          <m:t>=</m:t>
-        </m:r>
-        <m:r>
-          <m:t>20</m:t>
-        </m:r>
-      </m:oMath>
-      <w:r>
-        <w:t xml:space="preserve"> </w:t>
-      </w:r>
-      <w:r>
-        <w:t xml:space="preserve">(Both With SOH)</w:t>
+        <w:t xml:space="preserve">Fixed-Horizon Versus Hazard Model AUC</w:t>
       </w:r>
     </w:p>
     <w:tbl>
@@ -8768,7 +9059,7 @@
         <w:tblStyle w:val="Table"/>
         <w:tblW w:type="auto" w:w="0"/>
         <w:tblLook w:firstRow="1" w:lastRow="0" w:firstColumn="0" w:lastColumn="0" w:noHBand="0" w:noVBand="0" w:val="0020"/>
-        <w:tblCaption w:val="Fixed-Horizon XGBoost Versus the Discrete-Time Hazard Model (Survival Product), Fold-Mean AUC Within Dataset and Pooled Raw AUC on Transfer at H{=}20 (Both With SOH)"/>
+        <w:tblCaption w:val="Fixed-Horizon Versus Hazard Model AUC"/>
         <w:tblBorders>
           <w:top w:val="single" w:sz="8" w:color="000000"/>
           <w:bottom w:val="single" w:sz="8" w:color="000000"/>
@@ -8804,6 +9095,8 @@
             <w:r>
               <w:rPr>
                 <w:rFonts w:ascii="Times New Roman" w:hAnsi="Times New Roman"/>
+                <w:b/>
+                <w:bCs/>
                 <w:sz w:val="16"/>
               </w:rPr>
               <w:t xml:space="preserve">Setting</w:t>
@@ -8825,6 +9118,8 @@
             <w:r>
               <w:rPr>
                 <w:rFonts w:ascii="Times New Roman" w:hAnsi="Times New Roman"/>
+                <w:b/>
+                <w:bCs/>
                 <w:sz w:val="16"/>
               </w:rPr>
               <w:t xml:space="preserve">Fixed</w:t>
@@ -8832,6 +9127,8 @@
             <w:r>
               <w:rPr>
                 <w:rFonts w:ascii="Times New Roman" w:hAnsi="Times New Roman"/>
+                <w:b/>
+                <w:bCs/>
                 <w:sz w:val="16"/>
               </w:rPr>
               <w:t xml:space="preserve"> </w:t>
@@ -8867,6 +9164,8 @@
             <w:r>
               <w:rPr>
                 <w:rFonts w:ascii="Times New Roman" w:hAnsi="Times New Roman"/>
+                <w:b/>
+                <w:bCs/>
                 <w:sz w:val="16"/>
               </w:rPr>
               <w:t xml:space="preserve">Hazard</w:t>
@@ -8874,6 +9173,8 @@
             <w:r>
               <w:rPr>
                 <w:rFonts w:ascii="Times New Roman" w:hAnsi="Times New Roman"/>
+                <w:b/>
+                <w:bCs/>
                 <w:sz w:val="16"/>
               </w:rPr>
               <w:t xml:space="preserve"> </w:t>
@@ -8909,6 +9210,8 @@
             <w:r>
               <w:rPr>
                 <w:rFonts w:ascii="Times New Roman" w:hAnsi="Times New Roman"/>
+                <w:b/>
+                <w:bCs/>
                 <w:sz w:val="16"/>
               </w:rPr>
               <w:t xml:space="preserve">Fixed</w:t>
@@ -8916,6 +9219,8 @@
             <w:r>
               <w:rPr>
                 <w:rFonts w:ascii="Times New Roman" w:hAnsi="Times New Roman"/>
+                <w:b/>
+                <w:bCs/>
                 <w:sz w:val="16"/>
               </w:rPr>
               <w:t xml:space="preserve"> </w:t>
@@ -8951,6 +9256,8 @@
             <w:r>
               <w:rPr>
                 <w:rFonts w:ascii="Times New Roman" w:hAnsi="Times New Roman"/>
+                <w:b/>
+                <w:bCs/>
                 <w:sz w:val="16"/>
               </w:rPr>
               <w:t xml:space="preserve">Hazard</w:t>
@@ -8958,6 +9265,8 @@
             <w:r>
               <w:rPr>
                 <w:rFonts w:ascii="Times New Roman" w:hAnsi="Times New Roman"/>
+                <w:b/>
+                <w:bCs/>
                 <w:sz w:val="16"/>
               </w:rPr>
               <w:t xml:space="preserve"> </w:t>
@@ -9230,16 +9539,30 @@
               <w:spacing w:after="20" w:before="20"/>
               <w:jc w:val="center"/>
             </w:pPr>
-          </w:p>
-        </w:tc>
-        <w:tc>
-          <w:tcPr/>
-          <w:p>
-            <w:pPr>
-              <w:pStyle w:val="Compact"/>
-              <w:spacing w:after="20" w:before="20"/>
-              <w:jc w:val="center"/>
-            </w:pPr>
+            <w:r>
+              <w:rPr>
+                <w:rFonts w:ascii="Times New Roman" w:hAnsi="Times New Roman"/>
+                <w:sz w:val="16"/>
+              </w:rPr>
+              <w:t xml:space="preserve">—</w:t>
+            </w:r>
+          </w:p>
+        </w:tc>
+        <w:tc>
+          <w:tcPr/>
+          <w:p>
+            <w:pPr>
+              <w:pStyle w:val="Compact"/>
+              <w:spacing w:after="20" w:before="20"/>
+              <w:jc w:val="center"/>
+            </w:pPr>
+            <w:r>
+              <w:rPr>
+                <w:rFonts w:ascii="Times New Roman" w:hAnsi="Times New Roman"/>
+                <w:sz w:val="16"/>
+              </w:rPr>
+              <w:t xml:space="preserve">—</w:t>
+            </w:r>
           </w:p>
         </w:tc>
       </w:tr>
@@ -9320,16 +9643,30 @@
               <w:spacing w:after="20" w:before="20"/>
               <w:jc w:val="center"/>
             </w:pPr>
-          </w:p>
-        </w:tc>
-        <w:tc>
-          <w:tcPr/>
-          <w:p>
-            <w:pPr>
-              <w:pStyle w:val="Compact"/>
-              <w:spacing w:after="20" w:before="20"/>
-              <w:jc w:val="center"/>
-            </w:pPr>
+            <w:r>
+              <w:rPr>
+                <w:rFonts w:ascii="Times New Roman" w:hAnsi="Times New Roman"/>
+                <w:sz w:val="16"/>
+              </w:rPr>
+              <w:t xml:space="preserve">—</w:t>
+            </w:r>
+          </w:p>
+        </w:tc>
+        <w:tc>
+          <w:tcPr/>
+          <w:p>
+            <w:pPr>
+              <w:pStyle w:val="Compact"/>
+              <w:spacing w:after="20" w:before="20"/>
+              <w:jc w:val="center"/>
+            </w:pPr>
+            <w:r>
+              <w:rPr>
+                <w:rFonts w:ascii="Times New Roman" w:hAnsi="Times New Roman"/>
+                <w:sz w:val="16"/>
+              </w:rPr>
+              <w:t xml:space="preserve">—</w:t>
+            </w:r>
           </w:p>
         </w:tc>
       </w:tr>
@@ -9410,16 +9747,30 @@
               <w:spacing w:after="20" w:before="20"/>
               <w:jc w:val="center"/>
             </w:pPr>
-          </w:p>
-        </w:tc>
-        <w:tc>
-          <w:tcPr/>
-          <w:p>
-            <w:pPr>
-              <w:pStyle w:val="Compact"/>
-              <w:spacing w:after="20" w:before="20"/>
-              <w:jc w:val="center"/>
-            </w:pPr>
+            <w:r>
+              <w:rPr>
+                <w:rFonts w:ascii="Times New Roman" w:hAnsi="Times New Roman"/>
+                <w:sz w:val="16"/>
+              </w:rPr>
+              <w:t xml:space="preserve">—</w:t>
+            </w:r>
+          </w:p>
+        </w:tc>
+        <w:tc>
+          <w:tcPr/>
+          <w:p>
+            <w:pPr>
+              <w:pStyle w:val="Compact"/>
+              <w:spacing w:after="20" w:before="20"/>
+              <w:jc w:val="center"/>
+            </w:pPr>
+            <w:r>
+              <w:rPr>
+                <w:rFonts w:ascii="Times New Roman" w:hAnsi="Times New Roman"/>
+                <w:sz w:val="16"/>
+              </w:rPr>
+              <w:t xml:space="preserve">—</w:t>
+            </w:r>
           </w:p>
         </w:tc>
       </w:tr>
@@ -9500,16 +9851,30 @@
               <w:spacing w:after="20" w:before="20"/>
               <w:jc w:val="center"/>
             </w:pPr>
-          </w:p>
-        </w:tc>
-        <w:tc>
-          <w:tcPr/>
-          <w:p>
-            <w:pPr>
-              <w:pStyle w:val="Compact"/>
-              <w:spacing w:after="20" w:before="20"/>
-              <w:jc w:val="center"/>
-            </w:pPr>
+            <w:r>
+              <w:rPr>
+                <w:rFonts w:ascii="Times New Roman" w:hAnsi="Times New Roman"/>
+                <w:sz w:val="16"/>
+              </w:rPr>
+              <w:t xml:space="preserve">—</w:t>
+            </w:r>
+          </w:p>
+        </w:tc>
+        <w:tc>
+          <w:tcPr/>
+          <w:p>
+            <w:pPr>
+              <w:pStyle w:val="Compact"/>
+              <w:spacing w:after="20" w:before="20"/>
+              <w:jc w:val="center"/>
+            </w:pPr>
+            <w:r>
+              <w:rPr>
+                <w:rFonts w:ascii="Times New Roman" w:hAnsi="Times New Roman"/>
+                <w:sz w:val="16"/>
+              </w:rPr>
+              <w:t xml:space="preserve">—</w:t>
+            </w:r>
           </w:p>
         </w:tc>
       </w:tr>
@@ -9590,16 +9955,30 @@
               <w:spacing w:after="20" w:before="20"/>
               <w:jc w:val="center"/>
             </w:pPr>
-          </w:p>
-        </w:tc>
-        <w:tc>
-          <w:tcPr/>
-          <w:p>
-            <w:pPr>
-              <w:pStyle w:val="Compact"/>
-              <w:spacing w:after="20" w:before="20"/>
-              <w:jc w:val="center"/>
-            </w:pPr>
+            <w:r>
+              <w:rPr>
+                <w:rFonts w:ascii="Times New Roman" w:hAnsi="Times New Roman"/>
+                <w:sz w:val="16"/>
+              </w:rPr>
+              <w:t xml:space="preserve">—</w:t>
+            </w:r>
+          </w:p>
+        </w:tc>
+        <w:tc>
+          <w:tcPr/>
+          <w:p>
+            <w:pPr>
+              <w:pStyle w:val="Compact"/>
+              <w:spacing w:after="20" w:before="20"/>
+              <w:jc w:val="center"/>
+            </w:pPr>
+            <w:r>
+              <w:rPr>
+                <w:rFonts w:ascii="Times New Roman" w:hAnsi="Times New Roman"/>
+                <w:sz w:val="16"/>
+              </w:rPr>
+              <w:t xml:space="preserve">—</w:t>
+            </w:r>
           </w:p>
         </w:tc>
       </w:tr>
@@ -9680,16 +10059,30 @@
               <w:spacing w:after="20" w:before="20"/>
               <w:jc w:val="center"/>
             </w:pPr>
-          </w:p>
-        </w:tc>
-        <w:tc>
-          <w:tcPr/>
-          <w:p>
-            <w:pPr>
-              <w:pStyle w:val="Compact"/>
-              <w:spacing w:after="20" w:before="20"/>
-              <w:jc w:val="center"/>
-            </w:pPr>
+            <w:r>
+              <w:rPr>
+                <w:rFonts w:ascii="Times New Roman" w:hAnsi="Times New Roman"/>
+                <w:sz w:val="16"/>
+              </w:rPr>
+              <w:t xml:space="preserve">—</w:t>
+            </w:r>
+          </w:p>
+        </w:tc>
+        <w:tc>
+          <w:tcPr/>
+          <w:p>
+            <w:pPr>
+              <w:pStyle w:val="Compact"/>
+              <w:spacing w:after="20" w:before="20"/>
+              <w:jc w:val="center"/>
+            </w:pPr>
+            <w:r>
+              <w:rPr>
+                <w:rFonts w:ascii="Times New Roman" w:hAnsi="Times New Roman"/>
+                <w:sz w:val="16"/>
+              </w:rPr>
+              <w:t xml:space="preserve">—</w:t>
+            </w:r>
           </w:p>
         </w:tc>
       </w:tr>
@@ -10255,31 +10648,25 @@
         <w:t xml:space="preserve"> </w:t>
       </w:r>
       <w:r>
-        <w:t xml:space="preserve">same SOH dependence as every other model — formulating the output</w:t>
-      </w:r>
-      <w:r>
-        <w:t xml:space="preserve"> </w:t>
-      </w:r>
-      <w:r>
-        <w:t xml:space="preserve">does not exempt the inputs from dataset shift — and behaves</w:t>
-      </w:r>
-      <w:r>
-        <w:t xml:space="preserve"> </w:t>
-      </w:r>
-      <w:r>
-        <w:t xml:space="preserve">source-dependently (0.97 down to 0.31 pooled on Oxford), but it removes</w:t>
-      </w:r>
-      <w:r>
-        <w:t xml:space="preserve"> </w:t>
-      </w:r>
-      <w:r>
-        <w:t xml:space="preserve">the monotonicity incoherence entirely: its violation rate is zero by</w:t>
-      </w:r>
-      <w:r>
-        <w:t xml:space="preserve"> </w:t>
-      </w:r>
-      <w:r>
-        <w:t xml:space="preserve">construction.</w:t>
+        <w:t xml:space="preserve">same SOH dependence as every other model, because formulating the</w:t>
+      </w:r>
+      <w:r>
+        <w:t xml:space="preserve"> </w:t>
+      </w:r>
+      <w:r>
+        <w:t xml:space="preserve">output does not exempt the inputs from dataset shift, and behaves</w:t>
+      </w:r>
+      <w:r>
+        <w:t xml:space="preserve"> </w:t>
+      </w:r>
+      <w:r>
+        <w:t xml:space="preserve">source-dependently (0.97 down to 0.31 pooled on Oxford). Its</w:t>
+      </w:r>
+      <w:r>
+        <w:t xml:space="preserve"> </w:t>
+      </w:r>
+      <w:r>
+        <w:t xml:space="preserve">monotonicity violation rate is zero by construction.</w:t>
       </w:r>
     </w:p>
     <w:bookmarkEnd w:id="43"/>
@@ -10297,7 +10684,13 @@
         <w:pStyle w:val="FirstParagraph"/>
       </w:pPr>
       <w:r>
-        <w:t xml:space="preserve">AUC treats all errors as equal; a BMS does not. We select the decision</w:t>
+        <w:t xml:space="preserve">AUC weights all errors equally, whereas a BMS must trade false</w:t>
+      </w:r>
+      <w:r>
+        <w:t xml:space="preserve"> </w:t>
+      </w:r>
+      <w:r>
+        <w:t xml:space="preserve">negatives against false positives. We select the decision</w:t>
       </w:r>
       <w:r>
         <w:t xml:space="preserve"> </w:t>
@@ -10327,19 +10720,13 @@
         <w:t xml:space="preserve"> </w:t>
       </w:r>
       <w:r>
-        <w:t xml:space="preserve">more than doubles to 70% with the full budget spent, and calibrated</w:t>
-      </w:r>
-      <w:r>
-        <w:t xml:space="preserve"> </w:t>
-      </w:r>
-      <w:r>
-        <w:t xml:space="preserve">scores differ only marginally — under shift the ranking is the asset</w:t>
-      </w:r>
-      <w:r>
-        <w:t xml:space="preserve"> </w:t>
-      </w:r>
-      <w:r>
-        <w:t xml:space="preserve">and the ranking is what collapsed. On Oxford, nearly every row is</w:t>
+        <w:t xml:space="preserve">rises to 70% with the full budget spent. The three score types differ</w:t>
+      </w:r>
+      <w:r>
+        <w:t xml:space="preserve"> </w:t>
+      </w:r>
+      <w:r>
+        <w:t xml:space="preserve">only marginally in this setting. On Oxford, nearly every row is</w:t>
       </w:r>
       <w:r>
         <w:t xml:space="preserve"> </w:t>
@@ -10351,7 +10738,7 @@
         <w:t xml:space="preserve"> </w:t>
       </w:r>
       <w:r>
-        <w:t xml:space="preserve">operating point exists at all (Section II-B).</w:t>
+        <w:t xml:space="preserve">operating point exists (Section II-B).</w:t>
       </w:r>
     </w:p>
     <w:bookmarkStart w:id="44" w:name="tab:operational"/>
@@ -10383,25 +10770,7 @@
         <w:t xml:space="preserve"> </w:t>
       </w:r>
       <w:r>
-        <w:t xml:space="preserve">(XGBoost, ALL-LCO Source):</w:t>
-      </w:r>
-      <w:r>
-        <w:t xml:space="preserve"> </w:t>
-      </w:r>
-      <w:r>
-        <w:t xml:space="preserve">Threshold Selected on Source Out-of-Fold Scores With a 10%</w:t>
-      </w:r>
-      <w:r>
-        <w:t xml:space="preserve"> </w:t>
-      </w:r>
-      <w:r>
-        <w:t xml:space="preserve">False-Alarm Budget, Then Applied Unchanged to the Target — Target</w:t>
-      </w:r>
-      <w:r>
-        <w:t xml:space="preserve"> </w:t>
-      </w:r>
-      <w:r>
-        <w:t xml:space="preserve">FNR% / FPR%</w:t>
+        <w:t xml:space="preserve">(Target FNR% / FPR%)</w:t>
       </w:r>
     </w:p>
     <w:tbl>
@@ -10409,7 +10778,7 @@
         <w:tblStyle w:val="Table"/>
         <w:tblW w:type="auto" w:w="0"/>
         <w:tblLook w:firstRow="1" w:lastRow="0" w:firstColumn="0" w:lastColumn="0" w:noHBand="0" w:noVBand="0" w:val="0020"/>
-        <w:tblCaption w:val="Operational Evaluation at H{=}20 (XGBoost, ALL-LCO Source): Threshold Selected on Source Out-of-Fold Scores With a 10% False-Alarm Budget, Then Applied Unchanged to the Target — Target FNR% / FPR%"/>
+        <w:tblCaption w:val="Operational Evaluation at H{=}20 (Target FNR% / FPR%)"/>
         <w:tblBorders>
           <w:top w:val="single" w:sz="8" w:color="000000"/>
           <w:bottom w:val="single" w:sz="8" w:color="000000"/>
@@ -10445,6 +10814,8 @@
             <w:r>
               <w:rPr>
                 <w:rFonts w:ascii="Times New Roman" w:hAnsi="Times New Roman"/>
+                <w:b/>
+                <w:bCs/>
                 <w:sz w:val="16"/>
               </w:rPr>
               <w:t xml:space="preserve">Target</w:t>
@@ -10466,6 +10837,8 @@
             <w:r>
               <w:rPr>
                 <w:rFonts w:ascii="Times New Roman" w:hAnsi="Times New Roman"/>
+                <w:b/>
+                <w:bCs/>
                 <w:sz w:val="16"/>
               </w:rPr>
               <w:t xml:space="preserve">Features</w:t>
@@ -10487,6 +10860,8 @@
             <w:r>
               <w:rPr>
                 <w:rFonts w:ascii="Times New Roman" w:hAnsi="Times New Roman"/>
+                <w:b/>
+                <w:bCs/>
                 <w:sz w:val="16"/>
               </w:rPr>
               <w:t xml:space="preserve">raw</w:t>
@@ -10508,6 +10883,8 @@
             <w:r>
               <w:rPr>
                 <w:rFonts w:ascii="Times New Roman" w:hAnsi="Times New Roman"/>
+                <w:b/>
+                <w:bCs/>
                 <w:sz w:val="16"/>
               </w:rPr>
               <w:t xml:space="preserve">Platt</w:t>
@@ -10529,6 +10906,8 @@
             <w:r>
               <w:rPr>
                 <w:rFonts w:ascii="Times New Roman" w:hAnsi="Times New Roman"/>
+                <w:b/>
+                <w:bCs/>
                 <w:sz w:val="16"/>
               </w:rPr>
               <w:t xml:space="preserve">Isotonic</w:t>
@@ -10915,19 +11294,7 @@
         <w:t xml:space="preserve"> </w:t>
       </w:r>
       <w:r>
-        <w:t xml:space="preserve">(ALL-LCO Source): Pooled AUC With and</w:t>
-      </w:r>
-      <w:r>
-        <w:t xml:space="preserve"> </w:t>
-      </w:r>
-      <w:r>
-        <w:t xml:space="preserve">Without SOH, Paired Cell-Level Bootstrap 95% CI on the Difference</w:t>
-      </w:r>
-      <w:r>
-        <w:t xml:space="preserve"> </w:t>
-      </w:r>
-      <w:r>
-        <w:t xml:space="preserve">(Primary), and Cycle-Level DeLong</w:t>
+        <w:t xml:space="preserve">With Bootstrap CI and DeLong</w:t>
       </w:r>
       <w:r>
         <w:t xml:space="preserve"> </w:t>
@@ -10938,13 +11305,7 @@
         </m:r>
       </m:oMath>
       <w:r>
-        <w:t xml:space="preserve">-Value (Secondary; Inflated by</w:t>
-      </w:r>
-      <w:r>
-        <w:t xml:space="preserve"> </w:t>
-      </w:r>
-      <w:r>
-        <w:t xml:space="preserve">Within-Cell Correlation)</w:t>
+        <w:t xml:space="preserve">-Value</w:t>
       </w:r>
     </w:p>
     <w:tbl>
@@ -10952,7 +11313,7 @@
         <w:tblStyle w:val="Table"/>
         <w:tblW w:type="auto" w:w="0"/>
         <w:tblLook w:firstRow="1" w:lastRow="0" w:firstColumn="0" w:lastColumn="0" w:noHBand="0" w:noVBand="0" w:val="0020"/>
-        <w:tblCaption w:val="SOH Ablation at H{=}20 (ALL-LCO Source): Pooled AUC With and Without SOH, Paired Cell-Level Bootstrap 95% CI on the Difference (Primary), and Cycle-Level DeLong p-Value (Secondary; Inflated by Within-Cell Correlation)"/>
+        <w:tblCaption w:val="SOH Ablation at H{=}20 With Bootstrap CI and DeLong p-Value"/>
         <w:tblBorders>
           <w:top w:val="single" w:sz="8" w:color="000000"/>
           <w:bottom w:val="single" w:sz="8" w:color="000000"/>
@@ -10989,6 +11350,8 @@
             <w:r>
               <w:rPr>
                 <w:rFonts w:ascii="Times New Roman" w:hAnsi="Times New Roman"/>
+                <w:b/>
+                <w:bCs/>
                 <w:sz w:val="16"/>
               </w:rPr>
               <w:t xml:space="preserve">Target</w:t>
@@ -11010,6 +11373,8 @@
             <w:r>
               <w:rPr>
                 <w:rFonts w:ascii="Times New Roman" w:hAnsi="Times New Roman"/>
+                <w:b/>
+                <w:bCs/>
                 <w:sz w:val="16"/>
               </w:rPr>
               <w:t xml:space="preserve">Model</w:t>
@@ -11031,6 +11396,8 @@
             <w:r>
               <w:rPr>
                 <w:rFonts w:ascii="Times New Roman" w:hAnsi="Times New Roman"/>
+                <w:b/>
+                <w:bCs/>
                 <w:sz w:val="16"/>
               </w:rPr>
               <w:t xml:space="preserve">w/ SOH</w:t>
@@ -11052,6 +11419,8 @@
             <w:r>
               <w:rPr>
                 <w:rFonts w:ascii="Times New Roman" w:hAnsi="Times New Roman"/>
+                <w:b/>
+                <w:bCs/>
                 <w:sz w:val="16"/>
               </w:rPr>
               <w:t xml:space="preserve">w/o</w:t>
@@ -11081,6 +11450,8 @@
             <w:r>
               <w:rPr>
                 <w:rFonts w:ascii="Times New Roman" w:hAnsi="Times New Roman"/>
+                <w:b/>
+                <w:bCs/>
                 <w:sz w:val="16"/>
               </w:rPr>
               <w:t xml:space="preserve">AUC [CI]</w:t>
@@ -11102,6 +11473,8 @@
             <w:r>
               <w:rPr>
                 <w:rFonts w:ascii="Times New Roman" w:hAnsi="Times New Roman"/>
+                <w:b/>
+                <w:bCs/>
                 <w:sz w:val="16"/>
               </w:rPr>
               <w:t xml:space="preserve">DeLong</w:t>
@@ -11109,6 +11482,8 @@
             <w:r>
               <w:rPr>
                 <w:rFonts w:ascii="Times New Roman" w:hAnsi="Times New Roman"/>
+                <w:b/>
+                <w:bCs/>
                 <w:sz w:val="16"/>
               </w:rPr>
               <w:t xml:space="preserve"> </w:t>
@@ -11865,25 +12240,19 @@
         <w:t xml:space="preserve"> </w:t>
       </w:r>
       <w:r>
-        <w:t xml:space="preserve">excludes zero by a wide margin for every model; on Oxford the</w:t>
-      </w:r>
-      <w:r>
-        <w:t xml:space="preserve"> </w:t>
-      </w:r>
-      <w:r>
-        <w:t xml:space="preserve">equivalent interval is uninformative (five cells, effectively four)</w:t>
-      </w:r>
-      <w:r>
-        <w:t xml:space="preserve"> </w:t>
-      </w:r>
-      <w:r>
-        <w:t xml:space="preserve">and we say so rather than lean on the astronomically small cycle-level</w:t>
-      </w:r>
-      <w:r>
-        <w:t xml:space="preserve"> </w:t>
-      </w:r>
-      <w:r>
-        <w:t xml:space="preserve">DeLong</w:t>
+        <w:t xml:space="preserve">excludes zero by a wide margin for every model. On Oxford the</w:t>
+      </w:r>
+      <w:r>
+        <w:t xml:space="preserve"> </w:t>
+      </w:r>
+      <w:r>
+        <w:t xml:space="preserve">equivalent interval is uninformative (five cells, effectively four),</w:t>
+      </w:r>
+      <w:r>
+        <w:t xml:space="preserve"> </w:t>
+      </w:r>
+      <w:r>
+        <w:t xml:space="preserve">so the cycle-level DeLong</w:t>
       </w:r>
       <w:r>
         <w:t xml:space="preserve"> </w:t>
@@ -11894,7 +12263,13 @@
         </m:r>
       </m:oMath>
       <w:r>
-        <w:t xml:space="preserve">-values, which are inflated by pseudoreplication. Within-dataset</w:t>
+        <w:t xml:space="preserve">-values, which are inflated by</w:t>
+      </w:r>
+      <w:r>
+        <w:t xml:space="preserve"> </w:t>
+      </w:r>
+      <w:r>
+        <w:t xml:space="preserve">pseudoreplication, are not used as primary evidence. Within-dataset</w:t>
       </w:r>
       <w:r>
         <w:t xml:space="preserve"> </w:t>
@@ -12177,13 +12552,13 @@
         <w:t xml:space="preserve"> </w:t>
       </w:r>
       <w:r>
-        <w:t xml:space="preserve">to SOH — partly because SOH defines the failure criterion itself,</w:t>
-      </w:r>
-      <w:r>
-        <w:t xml:space="preserve"> </w:t>
-      </w:r>
-      <w:r>
-        <w:t xml:space="preserve">which the failure-endpoint ablation quantifies — rather than to</w:t>
+        <w:t xml:space="preserve">to SOH, partly because SOH defines the failure criterion itself</w:t>
+      </w:r>
+      <w:r>
+        <w:t xml:space="preserve"> </w:t>
+      </w:r>
+      <w:r>
+        <w:t xml:space="preserve">(quantified by the failure-endpoint ablation), rather than to</w:t>
       </w:r>
       <w:r>
         <w:t xml:space="preserve"> </w:t>

</xml_diff>

<commit_message>
Conference: bake table rows into main.tex (kills dangling vertical stubs below \input tables), remove authors section, regenerate DOCX twin
</commit_message>
<xml_diff>
--- a/Multi_Horizon_Hazard_Models_for_Battery_Failure_Prediction_Within.docx
+++ b/Multi_Horizon_Hazard_Models_for_Battery_Failure_Prediction_Within.docx
@@ -16,31 +16,6 @@
       <w:pgMar w:top="1080" w:bottom="1440" w:left="900" w:right="900" w:header="480" w:footer="480" w:gutter="0"/>
       <w:type w:val="continuous"/>
     </w:sectPr>
-    <w:p>
-      <w:pPr>
-        <w:pStyle w:val="Author"/>
-      </w:pPr>
-    </w:p>
-    <w:p>
-      <w:pPr>
-        <w:pStyle w:val="Author"/>
-      </w:pPr>
-    </w:p>
-    <w:p>
-      <w:pPr>
-        <w:pStyle w:val="Author"/>
-      </w:pPr>
-    </w:p>
-    <w:p>
-      <w:pPr>
-        <w:pStyle w:val="Author"/>
-      </w:pPr>
-    </w:p>
-    <w:p>
-      <w:pPr>
-        <w:pStyle w:val="Author"/>
-      </w:pPr>
-    </w:p>
     <w:p>
       <w:pPr>
         <w:pStyle w:val="FirstParagraph"/>

</xml_diff>